<commit_message>
clean project and rebuild
</commit_message>
<xml_diff>
--- a/编译原理大作业一.docx
+++ b/编译原理大作业一.docx
@@ -360,7 +360,7 @@
         </w:p>
         <w:p>
           <w:pPr>
-            <w:pStyle w:val="5"/>
+            <w:pStyle w:val="6"/>
             <w:tabs>
               <w:tab w:val="right" w:leader="dot" w:pos="8306"/>
             </w:tabs>
@@ -472,7 +472,7 @@
         </w:p>
         <w:p>
           <w:pPr>
-            <w:pStyle w:val="6"/>
+            <w:pStyle w:val="7"/>
             <w:tabs>
               <w:tab w:val="right" w:leader="dot" w:pos="8306"/>
             </w:tabs>
@@ -559,7 +559,7 @@
         </w:p>
         <w:p>
           <w:pPr>
-            <w:pStyle w:val="6"/>
+            <w:pStyle w:val="7"/>
             <w:tabs>
               <w:tab w:val="right" w:leader="dot" w:pos="8306"/>
             </w:tabs>
@@ -646,7 +646,7 @@
         </w:p>
         <w:p>
           <w:pPr>
-            <w:pStyle w:val="6"/>
+            <w:pStyle w:val="7"/>
             <w:tabs>
               <w:tab w:val="right" w:leader="dot" w:pos="8306"/>
             </w:tabs>
@@ -733,7 +733,7 @@
         </w:p>
         <w:p>
           <w:pPr>
-            <w:pStyle w:val="5"/>
+            <w:pStyle w:val="6"/>
             <w:tabs>
               <w:tab w:val="right" w:leader="dot" w:pos="8306"/>
             </w:tabs>
@@ -821,7 +821,7 @@
         </w:p>
         <w:p>
           <w:pPr>
-            <w:pStyle w:val="6"/>
+            <w:pStyle w:val="7"/>
             <w:tabs>
               <w:tab w:val="right" w:leader="dot" w:pos="8306"/>
             </w:tabs>
@@ -908,7 +908,7 @@
         </w:p>
         <w:p>
           <w:pPr>
-            <w:pStyle w:val="6"/>
+            <w:pStyle w:val="7"/>
             <w:tabs>
               <w:tab w:val="right" w:leader="dot" w:pos="8306"/>
             </w:tabs>
@@ -995,7 +995,7 @@
         </w:p>
         <w:p>
           <w:pPr>
-            <w:pStyle w:val="6"/>
+            <w:pStyle w:val="7"/>
             <w:tabs>
               <w:tab w:val="right" w:leader="dot" w:pos="8306"/>
             </w:tabs>
@@ -1082,7 +1082,7 @@
         </w:p>
         <w:p>
           <w:pPr>
-            <w:pStyle w:val="5"/>
+            <w:pStyle w:val="6"/>
             <w:tabs>
               <w:tab w:val="right" w:leader="dot" w:pos="8306"/>
             </w:tabs>
@@ -1170,7 +1170,7 @@
         </w:p>
         <w:p>
           <w:pPr>
-            <w:pStyle w:val="6"/>
+            <w:pStyle w:val="7"/>
             <w:tabs>
               <w:tab w:val="right" w:leader="dot" w:pos="8306"/>
             </w:tabs>
@@ -1257,7 +1257,7 @@
         </w:p>
         <w:p>
           <w:pPr>
-            <w:pStyle w:val="6"/>
+            <w:pStyle w:val="7"/>
             <w:tabs>
               <w:tab w:val="right" w:leader="dot" w:pos="8306"/>
             </w:tabs>
@@ -1344,7 +1344,7 @@
         </w:p>
         <w:p>
           <w:pPr>
-            <w:pStyle w:val="6"/>
+            <w:pStyle w:val="7"/>
             <w:tabs>
               <w:tab w:val="right" w:leader="dot" w:pos="8306"/>
             </w:tabs>
@@ -1431,7 +1431,7 @@
         </w:p>
         <w:p>
           <w:pPr>
-            <w:pStyle w:val="5"/>
+            <w:pStyle w:val="6"/>
             <w:tabs>
               <w:tab w:val="right" w:leader="dot" w:pos="8306"/>
             </w:tabs>
@@ -1519,7 +1519,7 @@
         </w:p>
         <w:p>
           <w:pPr>
-            <w:pStyle w:val="5"/>
+            <w:pStyle w:val="6"/>
             <w:tabs>
               <w:tab w:val="right" w:leader="dot" w:pos="8306"/>
             </w:tabs>
@@ -1607,7 +1607,7 @@
         </w:p>
         <w:p>
           <w:pPr>
-            <w:pStyle w:val="5"/>
+            <w:pStyle w:val="6"/>
             <w:tabs>
               <w:tab w:val="right" w:leader="dot" w:pos="8306"/>
             </w:tabs>
@@ -1941,93 +1941,2378 @@
       <w:pPr>
         <w:ind w:firstLine="420" w:firstLineChars="200"/>
         <w:rPr>
-          <w:rFonts w:cs="Times New Roman"/>
-        </w:rPr>
-      </w:pPr>
-      <w:r>
-        <w:rPr>
-          <w:rFonts w:cs="Times New Roman"/>
-        </w:rPr>
-        <w:t>2.1 初始界面</w:t>
+          <w:rFonts w:hint="default" w:eastAsia="宋体" w:cs="Times New Roman"/>
+          <w:lang w:val="en-US" w:eastAsia="zh-CN"/>
+        </w:rPr>
+      </w:pPr>
+      <w:r>
+        <w:rPr>
+          <w:rFonts w:cs="Times New Roman"/>
+        </w:rPr>
+        <w:t xml:space="preserve">2.1 </w:t>
+      </w:r>
+      <w:r>
+        <w:rPr>
+          <w:rFonts w:hint="eastAsia" w:cs="Times New Roman"/>
+          <w:lang w:val="en-US" w:eastAsia="zh-CN"/>
+        </w:rPr>
+        <w:t>可视化整体架构</w:t>
       </w:r>
     </w:p>
     <w:p>
       <w:pPr>
         <w:ind w:firstLine="420" w:firstLineChars="200"/>
+        <w:rPr>
+          <w:rFonts w:hint="eastAsia" w:cs="Times New Roman"/>
+          <w:lang w:val="en-US" w:eastAsia="zh-CN"/>
+        </w:rPr>
+      </w:pPr>
+      <w:r>
+        <w:rPr>
+          <w:rFonts w:hint="eastAsia" w:cs="Times New Roman"/>
+          <w:lang w:val="en-US" w:eastAsia="zh-CN"/>
+        </w:rPr>
+        <w:t>可视化子系统是整个项目中独立于编译器核心的重要组成部分，其目标是将编译器各阶段产生的内部数据结构以直观、交互友好的方式呈现给用户，辅助编译原理课程的学习与理解。</w:t>
+      </w:r>
+    </w:p>
+    <w:p>
+      <w:pPr>
+        <w:ind w:firstLine="420" w:firstLineChars="200"/>
+        <w:rPr>
+          <w:rFonts w:hint="eastAsia" w:cs="Times New Roman"/>
+          <w:lang w:val="en-US" w:eastAsia="zh-CN"/>
+        </w:rPr>
+      </w:pPr>
+      <w:r>
+        <w:rPr>
+          <w:rFonts w:hint="eastAsia" w:cs="Times New Roman"/>
+          <w:lang w:val="en-US" w:eastAsia="zh-CN"/>
+        </w:rPr>
+        <w:t>可视化子系统共提供14项功能，涵盖编译器前端流水线的各个阶段：</w:t>
+      </w:r>
+    </w:p>
+    <w:tbl>
+      <w:tblPr>
+        <w:tblW w:w="0" w:type="auto"/>
+        <w:jc w:val="center"/>
+        <w:tblBorders>
+          <w:top w:val="none" w:color="auto" w:sz="0" w:space="0"/>
+          <w:left w:val="none" w:color="auto" w:sz="0" w:space="0"/>
+          <w:bottom w:val="none" w:color="auto" w:sz="0" w:space="0"/>
+          <w:right w:val="none" w:color="auto" w:sz="0" w:space="0"/>
+          <w:insideH w:val="none" w:color="auto" w:sz="0" w:space="0"/>
+          <w:insideV w:val="none" w:color="auto" w:sz="0" w:space="0"/>
+        </w:tblBorders>
+        <w:shd w:val="clear"/>
+        <w:tblLayout w:type="autofit"/>
+        <w:tblCellMar>
+          <w:top w:w="15" w:type="dxa"/>
+          <w:left w:w="15" w:type="dxa"/>
+          <w:bottom w:w="15" w:type="dxa"/>
+          <w:right w:w="15" w:type="dxa"/>
+        </w:tblCellMar>
+      </w:tblPr>
+      <w:tblGrid>
+        <w:gridCol w:w="1460"/>
+        <w:gridCol w:w="3814"/>
+      </w:tblGrid>
+      <w:tr>
+        <w:tblPrEx>
+          <w:tblBorders>
+            <w:top w:val="none" w:color="auto" w:sz="0" w:space="0"/>
+            <w:left w:val="none" w:color="auto" w:sz="0" w:space="0"/>
+            <w:bottom w:val="none" w:color="auto" w:sz="0" w:space="0"/>
+            <w:right w:val="none" w:color="auto" w:sz="0" w:space="0"/>
+            <w:insideH w:val="none" w:color="auto" w:sz="0" w:space="0"/>
+            <w:insideV w:val="none" w:color="auto" w:sz="0" w:space="0"/>
+          </w:tblBorders>
+          <w:shd w:val="clear"/>
+          <w:tblCellMar>
+            <w:top w:w="15" w:type="dxa"/>
+            <w:left w:w="15" w:type="dxa"/>
+            <w:bottom w:w="15" w:type="dxa"/>
+            <w:right w:w="15" w:type="dxa"/>
+          </w:tblCellMar>
+        </w:tblPrEx>
+        <w:trPr>
+          <w:jc w:val="center"/>
+        </w:trPr>
+        <w:tc>
+          <w:tcPr>
+            <w:tcW w:w="0" w:type="auto"/>
+            <w:tcBorders>
+              <w:top w:val="single" w:color="000000" w:sz="12" w:space="0"/>
+              <w:bottom w:val="single" w:color="000000" w:sz="4" w:space="0"/>
+              <w:tl2br w:val="nil"/>
+            </w:tcBorders>
+            <w:shd w:val="clear" w:color="auto" w:fill="FFFFFF"/>
+            <w:tcMar>
+              <w:top w:w="50" w:type="dxa"/>
+              <w:left w:w="100" w:type="dxa"/>
+              <w:bottom w:w="50" w:type="dxa"/>
+              <w:right w:w="100" w:type="dxa"/>
+            </w:tcMar>
+            <w:vAlign w:val="center"/>
+          </w:tcPr>
+          <w:p>
+            <w:pPr>
+              <w:ind w:firstLine="420" w:firstLineChars="200"/>
+              <w:jc w:val="both"/>
+              <w:rPr>
+                <w:rFonts w:hint="eastAsia" w:cs="Times New Roman"/>
+                <w:b w:val="0"/>
+                <w:color w:val="000000"/>
+                <w:lang w:val="en-US" w:eastAsia="zh-CN"/>
+              </w:rPr>
+            </w:pPr>
+            <w:r>
+              <w:rPr>
+                <w:rFonts w:hint="eastAsia" w:cs="Times New Roman"/>
+                <w:b w:val="0"/>
+                <w:color w:val="000000"/>
+                <w:lang w:val="en-US" w:eastAsia="zh-CN"/>
+              </w:rPr>
+              <w:t>阶段</w:t>
+            </w:r>
+          </w:p>
+        </w:tc>
+        <w:tc>
+          <w:tcPr>
+            <w:tcW w:w="0" w:type="auto"/>
+            <w:tcBorders>
+              <w:top w:val="single" w:color="000000" w:sz="12" w:space="0"/>
+              <w:bottom w:val="single" w:color="000000" w:sz="4" w:space="0"/>
+            </w:tcBorders>
+            <w:shd w:val="clear" w:color="auto" w:fill="FFFFFF"/>
+            <w:tcMar>
+              <w:top w:w="50" w:type="dxa"/>
+              <w:left w:w="100" w:type="dxa"/>
+              <w:bottom w:w="50" w:type="dxa"/>
+              <w:right w:w="100" w:type="dxa"/>
+            </w:tcMar>
+            <w:vAlign w:val="center"/>
+          </w:tcPr>
+          <w:p>
+            <w:pPr>
+              <w:ind w:firstLine="420" w:firstLineChars="200"/>
+              <w:jc w:val="both"/>
+              <w:rPr>
+                <w:rFonts w:hint="eastAsia" w:cs="Times New Roman"/>
+                <w:b w:val="0"/>
+                <w:color w:val="000000"/>
+                <w:lang w:val="en-US" w:eastAsia="zh-CN"/>
+              </w:rPr>
+            </w:pPr>
+            <w:r>
+              <w:rPr>
+                <w:rFonts w:hint="eastAsia" w:cs="Times New Roman"/>
+                <w:b w:val="0"/>
+                <w:color w:val="000000"/>
+                <w:lang w:val="en-US" w:eastAsia="zh-CN"/>
+              </w:rPr>
+              <w:t>可视化功能</w:t>
+            </w:r>
+          </w:p>
+        </w:tc>
+      </w:tr>
+      <w:tr>
+        <w:tblPrEx>
+          <w:tblBorders>
+            <w:top w:val="none" w:color="auto" w:sz="0" w:space="0"/>
+            <w:left w:val="none" w:color="auto" w:sz="0" w:space="0"/>
+            <w:bottom w:val="none" w:color="auto" w:sz="0" w:space="0"/>
+            <w:right w:val="none" w:color="auto" w:sz="0" w:space="0"/>
+            <w:insideH w:val="none" w:color="auto" w:sz="0" w:space="0"/>
+            <w:insideV w:val="none" w:color="auto" w:sz="0" w:space="0"/>
+          </w:tblBorders>
+          <w:tblCellMar>
+            <w:top w:w="15" w:type="dxa"/>
+            <w:left w:w="15" w:type="dxa"/>
+            <w:bottom w:w="15" w:type="dxa"/>
+            <w:right w:w="15" w:type="dxa"/>
+          </w:tblCellMar>
+        </w:tblPrEx>
+        <w:trPr>
+          <w:jc w:val="center"/>
+        </w:trPr>
+        <w:tc>
+          <w:tcPr>
+            <w:tcW w:w="0" w:type="auto"/>
+            <w:tcBorders>
+              <w:top w:val="single" w:color="000000" w:sz="4" w:space="0"/>
+            </w:tcBorders>
+            <w:shd w:val="clear" w:color="auto" w:fill="FFFFFF"/>
+            <w:tcMar>
+              <w:top w:w="50" w:type="dxa"/>
+              <w:left w:w="100" w:type="dxa"/>
+              <w:bottom w:w="50" w:type="dxa"/>
+              <w:right w:w="100" w:type="dxa"/>
+            </w:tcMar>
+            <w:vAlign w:val="center"/>
+          </w:tcPr>
+          <w:p>
+            <w:pPr>
+              <w:ind w:firstLine="420" w:firstLineChars="200"/>
+              <w:jc w:val="both"/>
+              <w:rPr>
+                <w:rFonts w:hint="eastAsia" w:cs="Times New Roman"/>
+                <w:b w:val="0"/>
+                <w:color w:val="000000"/>
+                <w:lang w:val="en-US" w:eastAsia="zh-CN"/>
+              </w:rPr>
+            </w:pPr>
+            <w:r>
+              <w:rPr>
+                <w:rFonts w:hint="eastAsia" w:cs="Times New Roman"/>
+                <w:b w:val="0"/>
+                <w:color w:val="000000"/>
+                <w:lang w:val="en-US" w:eastAsia="zh-CN"/>
+              </w:rPr>
+              <w:t>源代码</w:t>
+            </w:r>
+          </w:p>
+        </w:tc>
+        <w:tc>
+          <w:tcPr>
+            <w:tcW w:w="0" w:type="auto"/>
+            <w:tcBorders>
+              <w:top w:val="single" w:color="000000" w:sz="4" w:space="0"/>
+            </w:tcBorders>
+            <w:shd w:val="clear" w:color="auto" w:fill="FFFFFF"/>
+            <w:tcMar>
+              <w:top w:w="50" w:type="dxa"/>
+              <w:left w:w="100" w:type="dxa"/>
+              <w:bottom w:w="50" w:type="dxa"/>
+              <w:right w:w="100" w:type="dxa"/>
+            </w:tcMar>
+            <w:vAlign w:val="center"/>
+          </w:tcPr>
+          <w:p>
+            <w:pPr>
+              <w:ind w:firstLine="420" w:firstLineChars="200"/>
+              <w:jc w:val="both"/>
+              <w:rPr>
+                <w:rFonts w:hint="eastAsia" w:cs="Times New Roman"/>
+                <w:b w:val="0"/>
+                <w:color w:val="000000"/>
+                <w:lang w:val="en-US" w:eastAsia="zh-CN"/>
+              </w:rPr>
+            </w:pPr>
+            <w:r>
+              <w:rPr>
+                <w:rFonts w:hint="eastAsia" w:cs="Times New Roman"/>
+                <w:b w:val="0"/>
+                <w:color w:val="000000"/>
+                <w:lang w:val="en-US" w:eastAsia="zh-CN"/>
+              </w:rPr>
+              <w:t>语法着色编辑器</w:t>
+            </w:r>
+          </w:p>
+        </w:tc>
+      </w:tr>
+      <w:tr>
+        <w:tblPrEx>
+          <w:tblBorders>
+            <w:top w:val="none" w:color="auto" w:sz="0" w:space="0"/>
+            <w:left w:val="none" w:color="auto" w:sz="0" w:space="0"/>
+            <w:bottom w:val="none" w:color="auto" w:sz="0" w:space="0"/>
+            <w:right w:val="none" w:color="auto" w:sz="0" w:space="0"/>
+            <w:insideH w:val="none" w:color="auto" w:sz="0" w:space="0"/>
+            <w:insideV w:val="none" w:color="auto" w:sz="0" w:space="0"/>
+          </w:tblBorders>
+          <w:shd w:val="clear"/>
+          <w:tblCellMar>
+            <w:top w:w="15" w:type="dxa"/>
+            <w:left w:w="15" w:type="dxa"/>
+            <w:bottom w:w="15" w:type="dxa"/>
+            <w:right w:w="15" w:type="dxa"/>
+          </w:tblCellMar>
+        </w:tblPrEx>
+        <w:trPr>
+          <w:jc w:val="center"/>
+        </w:trPr>
+        <w:tc>
+          <w:tcPr>
+            <w:tcW w:w="0" w:type="auto"/>
+            <w:shd w:val="clear" w:color="auto" w:fill="FFFFFF"/>
+            <w:tcMar>
+              <w:top w:w="50" w:type="dxa"/>
+              <w:left w:w="100" w:type="dxa"/>
+              <w:bottom w:w="50" w:type="dxa"/>
+              <w:right w:w="100" w:type="dxa"/>
+            </w:tcMar>
+            <w:vAlign w:val="center"/>
+          </w:tcPr>
+          <w:p>
+            <w:pPr>
+              <w:ind w:firstLine="420" w:firstLineChars="200"/>
+              <w:jc w:val="both"/>
+              <w:rPr>
+                <w:rFonts w:hint="eastAsia" w:cs="Times New Roman"/>
+                <w:b w:val="0"/>
+                <w:color w:val="000000"/>
+                <w:lang w:val="en-US" w:eastAsia="zh-CN"/>
+              </w:rPr>
+            </w:pPr>
+            <w:r>
+              <w:rPr>
+                <w:rFonts w:hint="eastAsia" w:cs="Times New Roman"/>
+                <w:b w:val="0"/>
+                <w:color w:val="000000"/>
+                <w:lang w:val="en-US" w:eastAsia="zh-CN"/>
+              </w:rPr>
+              <w:t>词法分析</w:t>
+            </w:r>
+          </w:p>
+        </w:tc>
+        <w:tc>
+          <w:tcPr>
+            <w:tcW w:w="0" w:type="auto"/>
+            <w:shd w:val="clear" w:color="auto" w:fill="FFFFFF"/>
+            <w:tcMar>
+              <w:top w:w="50" w:type="dxa"/>
+              <w:left w:w="100" w:type="dxa"/>
+              <w:bottom w:w="50" w:type="dxa"/>
+              <w:right w:w="100" w:type="dxa"/>
+            </w:tcMar>
+            <w:vAlign w:val="center"/>
+          </w:tcPr>
+          <w:p>
+            <w:pPr>
+              <w:ind w:firstLine="420" w:firstLineChars="200"/>
+              <w:jc w:val="both"/>
+              <w:rPr>
+                <w:rFonts w:hint="eastAsia" w:cs="Times New Roman"/>
+                <w:b w:val="0"/>
+                <w:color w:val="000000"/>
+                <w:lang w:val="en-US" w:eastAsia="zh-CN"/>
+              </w:rPr>
+            </w:pPr>
+            <w:r>
+              <w:rPr>
+                <w:rFonts w:hint="eastAsia" w:cs="Times New Roman"/>
+                <w:b w:val="0"/>
+                <w:color w:val="000000"/>
+                <w:lang w:val="en-US" w:eastAsia="zh-CN"/>
+              </w:rPr>
+              <w:t>Token 流表格展示</w:t>
+            </w:r>
+          </w:p>
+        </w:tc>
+      </w:tr>
+      <w:tr>
+        <w:tblPrEx>
+          <w:tblBorders>
+            <w:top w:val="none" w:color="auto" w:sz="0" w:space="0"/>
+            <w:left w:val="none" w:color="auto" w:sz="0" w:space="0"/>
+            <w:bottom w:val="none" w:color="auto" w:sz="0" w:space="0"/>
+            <w:right w:val="none" w:color="auto" w:sz="0" w:space="0"/>
+            <w:insideH w:val="none" w:color="auto" w:sz="0" w:space="0"/>
+            <w:insideV w:val="none" w:color="auto" w:sz="0" w:space="0"/>
+          </w:tblBorders>
+          <w:shd w:val="clear"/>
+          <w:tblCellMar>
+            <w:top w:w="15" w:type="dxa"/>
+            <w:left w:w="15" w:type="dxa"/>
+            <w:bottom w:w="15" w:type="dxa"/>
+            <w:right w:w="15" w:type="dxa"/>
+          </w:tblCellMar>
+        </w:tblPrEx>
+        <w:trPr>
+          <w:jc w:val="center"/>
+        </w:trPr>
+        <w:tc>
+          <w:tcPr>
+            <w:tcW w:w="0" w:type="auto"/>
+            <w:shd w:val="clear" w:color="auto" w:fill="FFFFFF"/>
+            <w:tcMar>
+              <w:top w:w="50" w:type="dxa"/>
+              <w:left w:w="100" w:type="dxa"/>
+              <w:bottom w:w="50" w:type="dxa"/>
+              <w:right w:w="100" w:type="dxa"/>
+            </w:tcMar>
+            <w:vAlign w:val="center"/>
+          </w:tcPr>
+          <w:p>
+            <w:pPr>
+              <w:ind w:firstLine="420" w:firstLineChars="200"/>
+              <w:jc w:val="both"/>
+              <w:rPr>
+                <w:rFonts w:hint="eastAsia" w:cs="Times New Roman"/>
+                <w:b w:val="0"/>
+                <w:color w:val="000000"/>
+                <w:lang w:val="en-US" w:eastAsia="zh-CN"/>
+              </w:rPr>
+            </w:pPr>
+            <w:r>
+              <w:rPr>
+                <w:rFonts w:hint="eastAsia" w:cs="Times New Roman"/>
+                <w:b w:val="0"/>
+                <w:color w:val="000000"/>
+                <w:lang w:val="en-US" w:eastAsia="zh-CN"/>
+              </w:rPr>
+              <w:t>词法分析</w:t>
+            </w:r>
+          </w:p>
+        </w:tc>
+        <w:tc>
+          <w:tcPr>
+            <w:tcW w:w="0" w:type="auto"/>
+            <w:shd w:val="clear" w:color="auto" w:fill="FFFFFF"/>
+            <w:tcMar>
+              <w:top w:w="50" w:type="dxa"/>
+              <w:left w:w="100" w:type="dxa"/>
+              <w:bottom w:w="50" w:type="dxa"/>
+              <w:right w:w="100" w:type="dxa"/>
+            </w:tcMar>
+            <w:vAlign w:val="center"/>
+          </w:tcPr>
+          <w:p>
+            <w:pPr>
+              <w:ind w:firstLine="420" w:firstLineChars="200"/>
+              <w:jc w:val="both"/>
+              <w:rPr>
+                <w:rFonts w:hint="eastAsia" w:cs="Times New Roman"/>
+                <w:b w:val="0"/>
+                <w:color w:val="000000"/>
+                <w:lang w:val="en-US" w:eastAsia="zh-CN"/>
+              </w:rPr>
+            </w:pPr>
+            <w:r>
+              <w:rPr>
+                <w:rFonts w:hint="eastAsia" w:cs="Times New Roman"/>
+                <w:b w:val="0"/>
+                <w:color w:val="000000"/>
+                <w:lang w:val="en-US" w:eastAsia="zh-CN"/>
+              </w:rPr>
+              <w:t>Token 悬停/高亮联动</w:t>
+            </w:r>
+          </w:p>
+        </w:tc>
+      </w:tr>
+      <w:tr>
+        <w:tblPrEx>
+          <w:tblBorders>
+            <w:top w:val="none" w:color="auto" w:sz="0" w:space="0"/>
+            <w:left w:val="none" w:color="auto" w:sz="0" w:space="0"/>
+            <w:bottom w:val="none" w:color="auto" w:sz="0" w:space="0"/>
+            <w:right w:val="none" w:color="auto" w:sz="0" w:space="0"/>
+            <w:insideH w:val="none" w:color="auto" w:sz="0" w:space="0"/>
+            <w:insideV w:val="none" w:color="auto" w:sz="0" w:space="0"/>
+          </w:tblBorders>
+          <w:tblCellMar>
+            <w:top w:w="15" w:type="dxa"/>
+            <w:left w:w="15" w:type="dxa"/>
+            <w:bottom w:w="15" w:type="dxa"/>
+            <w:right w:w="15" w:type="dxa"/>
+          </w:tblCellMar>
+        </w:tblPrEx>
+        <w:trPr>
+          <w:jc w:val="center"/>
+        </w:trPr>
+        <w:tc>
+          <w:tcPr>
+            <w:tcW w:w="0" w:type="auto"/>
+            <w:shd w:val="clear" w:color="auto" w:fill="FFFFFF"/>
+            <w:tcMar>
+              <w:top w:w="50" w:type="dxa"/>
+              <w:left w:w="100" w:type="dxa"/>
+              <w:bottom w:w="50" w:type="dxa"/>
+              <w:right w:w="100" w:type="dxa"/>
+            </w:tcMar>
+            <w:vAlign w:val="center"/>
+          </w:tcPr>
+          <w:p>
+            <w:pPr>
+              <w:ind w:firstLine="420" w:firstLineChars="200"/>
+              <w:jc w:val="both"/>
+              <w:rPr>
+                <w:rFonts w:hint="eastAsia" w:cs="Times New Roman"/>
+                <w:b w:val="0"/>
+                <w:color w:val="000000"/>
+                <w:lang w:val="en-US" w:eastAsia="zh-CN"/>
+              </w:rPr>
+            </w:pPr>
+            <w:r>
+              <w:rPr>
+                <w:rFonts w:hint="eastAsia" w:cs="Times New Roman"/>
+                <w:b w:val="0"/>
+                <w:color w:val="000000"/>
+                <w:lang w:val="en-US" w:eastAsia="zh-CN"/>
+              </w:rPr>
+              <w:t>词法分析</w:t>
+            </w:r>
+          </w:p>
+        </w:tc>
+        <w:tc>
+          <w:tcPr>
+            <w:tcW w:w="0" w:type="auto"/>
+            <w:shd w:val="clear" w:color="auto" w:fill="FFFFFF"/>
+            <w:tcMar>
+              <w:top w:w="50" w:type="dxa"/>
+              <w:left w:w="100" w:type="dxa"/>
+              <w:bottom w:w="50" w:type="dxa"/>
+              <w:right w:w="100" w:type="dxa"/>
+            </w:tcMar>
+            <w:vAlign w:val="center"/>
+          </w:tcPr>
+          <w:p>
+            <w:pPr>
+              <w:ind w:firstLine="420" w:firstLineChars="200"/>
+              <w:jc w:val="both"/>
+              <w:rPr>
+                <w:rFonts w:hint="eastAsia" w:cs="Times New Roman"/>
+                <w:b w:val="0"/>
+                <w:color w:val="000000"/>
+                <w:lang w:val="en-US" w:eastAsia="zh-CN"/>
+              </w:rPr>
+            </w:pPr>
+            <w:r>
+              <w:rPr>
+                <w:rFonts w:hint="eastAsia" w:cs="Times New Roman"/>
+                <w:b w:val="0"/>
+                <w:color w:val="000000"/>
+                <w:lang w:val="en-US" w:eastAsia="zh-CN"/>
+              </w:rPr>
+              <w:t>Token 详情面板</w:t>
+            </w:r>
+          </w:p>
+        </w:tc>
+      </w:tr>
+      <w:tr>
+        <w:tblPrEx>
+          <w:tblBorders>
+            <w:top w:val="none" w:color="auto" w:sz="0" w:space="0"/>
+            <w:left w:val="none" w:color="auto" w:sz="0" w:space="0"/>
+            <w:bottom w:val="none" w:color="auto" w:sz="0" w:space="0"/>
+            <w:right w:val="none" w:color="auto" w:sz="0" w:space="0"/>
+            <w:insideH w:val="none" w:color="auto" w:sz="0" w:space="0"/>
+            <w:insideV w:val="none" w:color="auto" w:sz="0" w:space="0"/>
+          </w:tblBorders>
+          <w:tblCellMar>
+            <w:top w:w="15" w:type="dxa"/>
+            <w:left w:w="15" w:type="dxa"/>
+            <w:bottom w:w="15" w:type="dxa"/>
+            <w:right w:w="15" w:type="dxa"/>
+          </w:tblCellMar>
+        </w:tblPrEx>
+        <w:trPr>
+          <w:jc w:val="center"/>
+        </w:trPr>
+        <w:tc>
+          <w:tcPr>
+            <w:tcW w:w="0" w:type="auto"/>
+            <w:shd w:val="clear" w:color="auto" w:fill="FFFFFF"/>
+            <w:tcMar>
+              <w:top w:w="50" w:type="dxa"/>
+              <w:left w:w="100" w:type="dxa"/>
+              <w:bottom w:w="50" w:type="dxa"/>
+              <w:right w:w="100" w:type="dxa"/>
+            </w:tcMar>
+            <w:vAlign w:val="center"/>
+          </w:tcPr>
+          <w:p>
+            <w:pPr>
+              <w:ind w:firstLine="420" w:firstLineChars="200"/>
+              <w:jc w:val="both"/>
+              <w:rPr>
+                <w:rFonts w:hint="eastAsia" w:cs="Times New Roman"/>
+                <w:b w:val="0"/>
+                <w:color w:val="000000"/>
+                <w:lang w:val="en-US" w:eastAsia="zh-CN"/>
+              </w:rPr>
+            </w:pPr>
+            <w:r>
+              <w:rPr>
+                <w:rFonts w:hint="eastAsia" w:cs="Times New Roman"/>
+                <w:b w:val="0"/>
+                <w:color w:val="000000"/>
+                <w:lang w:val="en-US" w:eastAsia="zh-CN"/>
+              </w:rPr>
+              <w:t>语法分析</w:t>
+            </w:r>
+          </w:p>
+        </w:tc>
+        <w:tc>
+          <w:tcPr>
+            <w:tcW w:w="0" w:type="auto"/>
+            <w:shd w:val="clear" w:color="auto" w:fill="FFFFFF"/>
+            <w:tcMar>
+              <w:top w:w="50" w:type="dxa"/>
+              <w:left w:w="100" w:type="dxa"/>
+              <w:bottom w:w="50" w:type="dxa"/>
+              <w:right w:w="100" w:type="dxa"/>
+            </w:tcMar>
+            <w:vAlign w:val="center"/>
+          </w:tcPr>
+          <w:p>
+            <w:pPr>
+              <w:ind w:firstLine="420" w:firstLineChars="200"/>
+              <w:jc w:val="both"/>
+              <w:rPr>
+                <w:rFonts w:hint="eastAsia" w:cs="Times New Roman"/>
+                <w:b w:val="0"/>
+                <w:color w:val="000000"/>
+                <w:lang w:val="en-US" w:eastAsia="zh-CN"/>
+              </w:rPr>
+            </w:pPr>
+            <w:r>
+              <w:rPr>
+                <w:rFonts w:hint="eastAsia" w:cs="Times New Roman"/>
+                <w:b w:val="0"/>
+                <w:color w:val="000000"/>
+                <w:lang w:val="en-US" w:eastAsia="zh-CN"/>
+              </w:rPr>
+              <w:t>D3.js 语法树图</w:t>
+            </w:r>
+          </w:p>
+        </w:tc>
+      </w:tr>
+      <w:tr>
+        <w:tblPrEx>
+          <w:tblBorders>
+            <w:top w:val="none" w:color="auto" w:sz="0" w:space="0"/>
+            <w:left w:val="none" w:color="auto" w:sz="0" w:space="0"/>
+            <w:bottom w:val="none" w:color="auto" w:sz="0" w:space="0"/>
+            <w:right w:val="none" w:color="auto" w:sz="0" w:space="0"/>
+            <w:insideH w:val="none" w:color="auto" w:sz="0" w:space="0"/>
+            <w:insideV w:val="none" w:color="auto" w:sz="0" w:space="0"/>
+          </w:tblBorders>
+          <w:shd w:val="clear"/>
+          <w:tblCellMar>
+            <w:top w:w="15" w:type="dxa"/>
+            <w:left w:w="15" w:type="dxa"/>
+            <w:bottom w:w="15" w:type="dxa"/>
+            <w:right w:w="15" w:type="dxa"/>
+          </w:tblCellMar>
+        </w:tblPrEx>
+        <w:trPr>
+          <w:jc w:val="center"/>
+        </w:trPr>
+        <w:tc>
+          <w:tcPr>
+            <w:tcW w:w="0" w:type="auto"/>
+            <w:shd w:val="clear" w:color="auto" w:fill="FFFFFF"/>
+            <w:tcMar>
+              <w:top w:w="50" w:type="dxa"/>
+              <w:left w:w="100" w:type="dxa"/>
+              <w:bottom w:w="50" w:type="dxa"/>
+              <w:right w:w="100" w:type="dxa"/>
+            </w:tcMar>
+            <w:vAlign w:val="center"/>
+          </w:tcPr>
+          <w:p>
+            <w:pPr>
+              <w:ind w:firstLine="420" w:firstLineChars="200"/>
+              <w:jc w:val="both"/>
+              <w:rPr>
+                <w:rFonts w:hint="eastAsia" w:cs="Times New Roman"/>
+                <w:b w:val="0"/>
+                <w:color w:val="000000"/>
+                <w:lang w:val="en-US" w:eastAsia="zh-CN"/>
+              </w:rPr>
+            </w:pPr>
+            <w:r>
+              <w:rPr>
+                <w:rFonts w:hint="eastAsia" w:cs="Times New Roman"/>
+                <w:b w:val="0"/>
+                <w:color w:val="000000"/>
+                <w:lang w:val="en-US" w:eastAsia="zh-CN"/>
+              </w:rPr>
+              <w:t>语法分析</w:t>
+            </w:r>
+          </w:p>
+        </w:tc>
+        <w:tc>
+          <w:tcPr>
+            <w:tcW w:w="0" w:type="auto"/>
+            <w:shd w:val="clear" w:color="auto" w:fill="FFFFFF"/>
+            <w:tcMar>
+              <w:top w:w="50" w:type="dxa"/>
+              <w:left w:w="100" w:type="dxa"/>
+              <w:bottom w:w="50" w:type="dxa"/>
+              <w:right w:w="100" w:type="dxa"/>
+            </w:tcMar>
+            <w:vAlign w:val="center"/>
+          </w:tcPr>
+          <w:p>
+            <w:pPr>
+              <w:ind w:firstLine="420" w:firstLineChars="200"/>
+              <w:jc w:val="both"/>
+              <w:rPr>
+                <w:rFonts w:hint="eastAsia" w:cs="Times New Roman"/>
+                <w:b w:val="0"/>
+                <w:color w:val="000000"/>
+                <w:lang w:val="en-US" w:eastAsia="zh-CN"/>
+              </w:rPr>
+            </w:pPr>
+            <w:r>
+              <w:rPr>
+                <w:rFonts w:hint="eastAsia" w:cs="Times New Roman"/>
+                <w:b w:val="0"/>
+                <w:color w:val="000000"/>
+                <w:lang w:val="en-US" w:eastAsia="zh-CN"/>
+              </w:rPr>
+              <w:t>D3.js AST 树形图（彩色编码）</w:t>
+            </w:r>
+          </w:p>
+        </w:tc>
+      </w:tr>
+      <w:tr>
+        <w:tblPrEx>
+          <w:tblBorders>
+            <w:top w:val="none" w:color="auto" w:sz="0" w:space="0"/>
+            <w:left w:val="none" w:color="auto" w:sz="0" w:space="0"/>
+            <w:bottom w:val="none" w:color="auto" w:sz="0" w:space="0"/>
+            <w:right w:val="none" w:color="auto" w:sz="0" w:space="0"/>
+            <w:insideH w:val="none" w:color="auto" w:sz="0" w:space="0"/>
+            <w:insideV w:val="none" w:color="auto" w:sz="0" w:space="0"/>
+          </w:tblBorders>
+          <w:shd w:val="clear"/>
+          <w:tblCellMar>
+            <w:top w:w="15" w:type="dxa"/>
+            <w:left w:w="15" w:type="dxa"/>
+            <w:bottom w:w="15" w:type="dxa"/>
+            <w:right w:w="15" w:type="dxa"/>
+          </w:tblCellMar>
+        </w:tblPrEx>
+        <w:trPr>
+          <w:jc w:val="center"/>
+        </w:trPr>
+        <w:tc>
+          <w:tcPr>
+            <w:tcW w:w="0" w:type="auto"/>
+            <w:shd w:val="clear" w:color="auto" w:fill="FFFFFF"/>
+            <w:tcMar>
+              <w:top w:w="50" w:type="dxa"/>
+              <w:left w:w="100" w:type="dxa"/>
+              <w:bottom w:w="50" w:type="dxa"/>
+              <w:right w:w="100" w:type="dxa"/>
+            </w:tcMar>
+            <w:vAlign w:val="center"/>
+          </w:tcPr>
+          <w:p>
+            <w:pPr>
+              <w:ind w:firstLine="420" w:firstLineChars="200"/>
+              <w:jc w:val="both"/>
+              <w:rPr>
+                <w:rFonts w:hint="eastAsia" w:cs="Times New Roman"/>
+                <w:b w:val="0"/>
+                <w:color w:val="000000"/>
+                <w:lang w:val="en-US" w:eastAsia="zh-CN"/>
+              </w:rPr>
+            </w:pPr>
+            <w:r>
+              <w:rPr>
+                <w:rFonts w:hint="eastAsia" w:cs="Times New Roman"/>
+                <w:b w:val="0"/>
+                <w:color w:val="000000"/>
+                <w:lang w:val="en-US" w:eastAsia="zh-CN"/>
+              </w:rPr>
+              <w:t>语法分析</w:t>
+            </w:r>
+          </w:p>
+        </w:tc>
+        <w:tc>
+          <w:tcPr>
+            <w:tcW w:w="0" w:type="auto"/>
+            <w:shd w:val="clear" w:color="auto" w:fill="FFFFFF"/>
+            <w:tcMar>
+              <w:top w:w="50" w:type="dxa"/>
+              <w:left w:w="100" w:type="dxa"/>
+              <w:bottom w:w="50" w:type="dxa"/>
+              <w:right w:w="100" w:type="dxa"/>
+            </w:tcMar>
+            <w:vAlign w:val="center"/>
+          </w:tcPr>
+          <w:p>
+            <w:pPr>
+              <w:ind w:firstLine="420" w:firstLineChars="200"/>
+              <w:jc w:val="both"/>
+              <w:rPr>
+                <w:rFonts w:hint="eastAsia" w:cs="Times New Roman"/>
+                <w:b w:val="0"/>
+                <w:color w:val="000000"/>
+                <w:lang w:val="en-US" w:eastAsia="zh-CN"/>
+              </w:rPr>
+            </w:pPr>
+            <w:r>
+              <w:rPr>
+                <w:rFonts w:hint="eastAsia" w:cs="Times New Roman"/>
+                <w:b w:val="0"/>
+                <w:color w:val="000000"/>
+                <w:lang w:val="en-US" w:eastAsia="zh-CN"/>
+              </w:rPr>
+              <w:t>解析过程逐步动画</w:t>
+            </w:r>
+          </w:p>
+        </w:tc>
+      </w:tr>
+      <w:tr>
+        <w:tblPrEx>
+          <w:tblBorders>
+            <w:top w:val="none" w:color="auto" w:sz="0" w:space="0"/>
+            <w:left w:val="none" w:color="auto" w:sz="0" w:space="0"/>
+            <w:bottom w:val="none" w:color="auto" w:sz="0" w:space="0"/>
+            <w:right w:val="none" w:color="auto" w:sz="0" w:space="0"/>
+            <w:insideH w:val="none" w:color="auto" w:sz="0" w:space="0"/>
+            <w:insideV w:val="none" w:color="auto" w:sz="0" w:space="0"/>
+          </w:tblBorders>
+          <w:shd w:val="clear"/>
+          <w:tblCellMar>
+            <w:top w:w="15" w:type="dxa"/>
+            <w:left w:w="15" w:type="dxa"/>
+            <w:bottom w:w="15" w:type="dxa"/>
+            <w:right w:w="15" w:type="dxa"/>
+          </w:tblCellMar>
+        </w:tblPrEx>
+        <w:trPr>
+          <w:jc w:val="center"/>
+        </w:trPr>
+        <w:tc>
+          <w:tcPr>
+            <w:tcW w:w="0" w:type="auto"/>
+            <w:shd w:val="clear" w:color="auto" w:fill="FFFFFF"/>
+            <w:tcMar>
+              <w:top w:w="50" w:type="dxa"/>
+              <w:left w:w="100" w:type="dxa"/>
+              <w:bottom w:w="50" w:type="dxa"/>
+              <w:right w:w="100" w:type="dxa"/>
+            </w:tcMar>
+            <w:vAlign w:val="center"/>
+          </w:tcPr>
+          <w:p>
+            <w:pPr>
+              <w:ind w:firstLine="420" w:firstLineChars="200"/>
+              <w:jc w:val="both"/>
+              <w:rPr>
+                <w:rFonts w:hint="eastAsia" w:cs="Times New Roman"/>
+                <w:b w:val="0"/>
+                <w:color w:val="000000"/>
+                <w:lang w:val="en-US" w:eastAsia="zh-CN"/>
+              </w:rPr>
+            </w:pPr>
+            <w:r>
+              <w:rPr>
+                <w:rFonts w:hint="eastAsia" w:cs="Times New Roman"/>
+                <w:b w:val="0"/>
+                <w:color w:val="000000"/>
+                <w:lang w:val="en-US" w:eastAsia="zh-CN"/>
+              </w:rPr>
+              <w:t>语法分析</w:t>
+            </w:r>
+          </w:p>
+        </w:tc>
+        <w:tc>
+          <w:tcPr>
+            <w:tcW w:w="0" w:type="auto"/>
+            <w:shd w:val="clear" w:color="auto" w:fill="FFFFFF"/>
+            <w:tcMar>
+              <w:top w:w="50" w:type="dxa"/>
+              <w:left w:w="100" w:type="dxa"/>
+              <w:bottom w:w="50" w:type="dxa"/>
+              <w:right w:w="100" w:type="dxa"/>
+            </w:tcMar>
+            <w:vAlign w:val="center"/>
+          </w:tcPr>
+          <w:p>
+            <w:pPr>
+              <w:ind w:firstLine="420" w:firstLineChars="200"/>
+              <w:jc w:val="both"/>
+              <w:rPr>
+                <w:rFonts w:hint="eastAsia" w:cs="Times New Roman"/>
+                <w:b w:val="0"/>
+                <w:color w:val="000000"/>
+                <w:lang w:val="en-US" w:eastAsia="zh-CN"/>
+              </w:rPr>
+            </w:pPr>
+            <w:r>
+              <w:rPr>
+                <w:rFonts w:hint="eastAsia" w:cs="Times New Roman"/>
+                <w:b w:val="0"/>
+                <w:color w:val="000000"/>
+                <w:lang w:val="en-US" w:eastAsia="zh-CN"/>
+              </w:rPr>
+              <w:t>递归调用栈可视化</w:t>
+            </w:r>
+          </w:p>
+        </w:tc>
+      </w:tr>
+      <w:tr>
+        <w:tblPrEx>
+          <w:tblBorders>
+            <w:top w:val="none" w:color="auto" w:sz="0" w:space="0"/>
+            <w:left w:val="none" w:color="auto" w:sz="0" w:space="0"/>
+            <w:bottom w:val="none" w:color="auto" w:sz="0" w:space="0"/>
+            <w:right w:val="none" w:color="auto" w:sz="0" w:space="0"/>
+            <w:insideH w:val="none" w:color="auto" w:sz="0" w:space="0"/>
+            <w:insideV w:val="none" w:color="auto" w:sz="0" w:space="0"/>
+          </w:tblBorders>
+          <w:shd w:val="clear"/>
+          <w:tblCellMar>
+            <w:top w:w="15" w:type="dxa"/>
+            <w:left w:w="15" w:type="dxa"/>
+            <w:bottom w:w="15" w:type="dxa"/>
+            <w:right w:w="15" w:type="dxa"/>
+          </w:tblCellMar>
+        </w:tblPrEx>
+        <w:trPr>
+          <w:jc w:val="center"/>
+        </w:trPr>
+        <w:tc>
+          <w:tcPr>
+            <w:tcW w:w="0" w:type="auto"/>
+            <w:shd w:val="clear" w:color="auto" w:fill="FFFFFF"/>
+            <w:tcMar>
+              <w:top w:w="50" w:type="dxa"/>
+              <w:left w:w="100" w:type="dxa"/>
+              <w:bottom w:w="50" w:type="dxa"/>
+              <w:right w:w="100" w:type="dxa"/>
+            </w:tcMar>
+            <w:vAlign w:val="center"/>
+          </w:tcPr>
+          <w:p>
+            <w:pPr>
+              <w:ind w:firstLine="420" w:firstLineChars="200"/>
+              <w:jc w:val="both"/>
+              <w:rPr>
+                <w:rFonts w:hint="eastAsia" w:cs="Times New Roman"/>
+                <w:b w:val="0"/>
+                <w:color w:val="000000"/>
+                <w:lang w:val="en-US" w:eastAsia="zh-CN"/>
+              </w:rPr>
+            </w:pPr>
+            <w:r>
+              <w:rPr>
+                <w:rFonts w:hint="eastAsia" w:cs="Times New Roman"/>
+                <w:b w:val="0"/>
+                <w:color w:val="000000"/>
+                <w:lang w:val="en-US" w:eastAsia="zh-CN"/>
+              </w:rPr>
+              <w:t>语法分析</w:t>
+            </w:r>
+          </w:p>
+        </w:tc>
+        <w:tc>
+          <w:tcPr>
+            <w:tcW w:w="0" w:type="auto"/>
+            <w:shd w:val="clear" w:color="auto" w:fill="FFFFFF"/>
+            <w:tcMar>
+              <w:top w:w="50" w:type="dxa"/>
+              <w:left w:w="100" w:type="dxa"/>
+              <w:bottom w:w="50" w:type="dxa"/>
+              <w:right w:w="100" w:type="dxa"/>
+            </w:tcMar>
+            <w:vAlign w:val="center"/>
+          </w:tcPr>
+          <w:p>
+            <w:pPr>
+              <w:ind w:firstLine="420" w:firstLineChars="200"/>
+              <w:jc w:val="both"/>
+              <w:rPr>
+                <w:rFonts w:hint="eastAsia" w:cs="Times New Roman"/>
+                <w:b w:val="0"/>
+                <w:color w:val="000000"/>
+                <w:lang w:val="en-US" w:eastAsia="zh-CN"/>
+              </w:rPr>
+            </w:pPr>
+            <w:r>
+              <w:rPr>
+                <w:rFonts w:hint="eastAsia" w:cs="Times New Roman"/>
+                <w:b w:val="0"/>
+                <w:color w:val="000000"/>
+                <w:lang w:val="en-US" w:eastAsia="zh-CN"/>
+              </w:rPr>
+              <w:t>文法规则实时显示</w:t>
+            </w:r>
+          </w:p>
+        </w:tc>
+      </w:tr>
+      <w:tr>
+        <w:tblPrEx>
+          <w:tblBorders>
+            <w:top w:val="none" w:color="auto" w:sz="0" w:space="0"/>
+            <w:left w:val="none" w:color="auto" w:sz="0" w:space="0"/>
+            <w:bottom w:val="none" w:color="auto" w:sz="0" w:space="0"/>
+            <w:right w:val="none" w:color="auto" w:sz="0" w:space="0"/>
+            <w:insideH w:val="none" w:color="auto" w:sz="0" w:space="0"/>
+            <w:insideV w:val="none" w:color="auto" w:sz="0" w:space="0"/>
+          </w:tblBorders>
+          <w:shd w:val="clear"/>
+          <w:tblCellMar>
+            <w:top w:w="15" w:type="dxa"/>
+            <w:left w:w="15" w:type="dxa"/>
+            <w:bottom w:w="15" w:type="dxa"/>
+            <w:right w:w="15" w:type="dxa"/>
+          </w:tblCellMar>
+        </w:tblPrEx>
+        <w:trPr>
+          <w:jc w:val="center"/>
+        </w:trPr>
+        <w:tc>
+          <w:tcPr>
+            <w:tcW w:w="0" w:type="auto"/>
+            <w:shd w:val="clear" w:color="auto" w:fill="FFFFFF"/>
+            <w:tcMar>
+              <w:top w:w="50" w:type="dxa"/>
+              <w:left w:w="100" w:type="dxa"/>
+              <w:bottom w:w="50" w:type="dxa"/>
+              <w:right w:w="100" w:type="dxa"/>
+            </w:tcMar>
+            <w:vAlign w:val="center"/>
+          </w:tcPr>
+          <w:p>
+            <w:pPr>
+              <w:ind w:firstLine="420" w:firstLineChars="200"/>
+              <w:jc w:val="both"/>
+              <w:rPr>
+                <w:rFonts w:hint="eastAsia" w:cs="Times New Roman"/>
+                <w:b w:val="0"/>
+                <w:color w:val="000000"/>
+                <w:lang w:val="en-US" w:eastAsia="zh-CN"/>
+              </w:rPr>
+            </w:pPr>
+            <w:r>
+              <w:rPr>
+                <w:rFonts w:hint="eastAsia" w:cs="Times New Roman"/>
+                <w:b w:val="0"/>
+                <w:color w:val="000000"/>
+                <w:lang w:val="en-US" w:eastAsia="zh-CN"/>
+              </w:rPr>
+              <w:t>语义分析</w:t>
+            </w:r>
+          </w:p>
+        </w:tc>
+        <w:tc>
+          <w:tcPr>
+            <w:tcW w:w="0" w:type="auto"/>
+            <w:shd w:val="clear" w:color="auto" w:fill="FFFFFF"/>
+            <w:tcMar>
+              <w:top w:w="50" w:type="dxa"/>
+              <w:left w:w="100" w:type="dxa"/>
+              <w:bottom w:w="50" w:type="dxa"/>
+              <w:right w:w="100" w:type="dxa"/>
+            </w:tcMar>
+            <w:vAlign w:val="center"/>
+          </w:tcPr>
+          <w:p>
+            <w:pPr>
+              <w:ind w:firstLine="420" w:firstLineChars="200"/>
+              <w:jc w:val="both"/>
+              <w:rPr>
+                <w:rFonts w:hint="eastAsia" w:cs="Times New Roman"/>
+                <w:b w:val="0"/>
+                <w:color w:val="000000"/>
+                <w:lang w:val="en-US" w:eastAsia="zh-CN"/>
+              </w:rPr>
+            </w:pPr>
+            <w:r>
+              <w:rPr>
+                <w:rFonts w:hint="eastAsia" w:cs="Times New Roman"/>
+                <w:b w:val="0"/>
+                <w:color w:val="000000"/>
+                <w:lang w:val="en-US" w:eastAsia="zh-CN"/>
+              </w:rPr>
+              <w:t>符号表展示</w:t>
+            </w:r>
+          </w:p>
+        </w:tc>
+      </w:tr>
+      <w:tr>
+        <w:tblPrEx>
+          <w:tblBorders>
+            <w:top w:val="none" w:color="auto" w:sz="0" w:space="0"/>
+            <w:left w:val="none" w:color="auto" w:sz="0" w:space="0"/>
+            <w:bottom w:val="none" w:color="auto" w:sz="0" w:space="0"/>
+            <w:right w:val="none" w:color="auto" w:sz="0" w:space="0"/>
+            <w:insideH w:val="none" w:color="auto" w:sz="0" w:space="0"/>
+            <w:insideV w:val="none" w:color="auto" w:sz="0" w:space="0"/>
+          </w:tblBorders>
+          <w:shd w:val="clear"/>
+          <w:tblCellMar>
+            <w:top w:w="15" w:type="dxa"/>
+            <w:left w:w="15" w:type="dxa"/>
+            <w:bottom w:w="15" w:type="dxa"/>
+            <w:right w:w="15" w:type="dxa"/>
+          </w:tblCellMar>
+        </w:tblPrEx>
+        <w:trPr>
+          <w:jc w:val="center"/>
+        </w:trPr>
+        <w:tc>
+          <w:tcPr>
+            <w:tcW w:w="0" w:type="auto"/>
+            <w:shd w:val="clear" w:color="auto" w:fill="FFFFFF"/>
+            <w:tcMar>
+              <w:top w:w="50" w:type="dxa"/>
+              <w:left w:w="100" w:type="dxa"/>
+              <w:bottom w:w="50" w:type="dxa"/>
+              <w:right w:w="100" w:type="dxa"/>
+            </w:tcMar>
+            <w:vAlign w:val="center"/>
+          </w:tcPr>
+          <w:p>
+            <w:pPr>
+              <w:ind w:firstLine="420" w:firstLineChars="200"/>
+              <w:jc w:val="both"/>
+              <w:rPr>
+                <w:rFonts w:hint="eastAsia" w:cs="Times New Roman"/>
+                <w:b w:val="0"/>
+                <w:color w:val="000000"/>
+                <w:lang w:val="en-US" w:eastAsia="zh-CN"/>
+              </w:rPr>
+            </w:pPr>
+            <w:r>
+              <w:rPr>
+                <w:rFonts w:hint="eastAsia" w:cs="Times New Roman"/>
+                <w:b w:val="0"/>
+                <w:color w:val="000000"/>
+                <w:lang w:val="en-US" w:eastAsia="zh-CN"/>
+              </w:rPr>
+              <w:t>通用</w:t>
+            </w:r>
+          </w:p>
+        </w:tc>
+        <w:tc>
+          <w:tcPr>
+            <w:tcW w:w="0" w:type="auto"/>
+            <w:shd w:val="clear" w:color="auto" w:fill="FFFFFF"/>
+            <w:tcMar>
+              <w:top w:w="50" w:type="dxa"/>
+              <w:left w:w="100" w:type="dxa"/>
+              <w:bottom w:w="50" w:type="dxa"/>
+              <w:right w:w="100" w:type="dxa"/>
+            </w:tcMar>
+            <w:vAlign w:val="center"/>
+          </w:tcPr>
+          <w:p>
+            <w:pPr>
+              <w:ind w:firstLine="420" w:firstLineChars="200"/>
+              <w:jc w:val="both"/>
+              <w:rPr>
+                <w:rFonts w:hint="eastAsia" w:cs="Times New Roman"/>
+                <w:b w:val="0"/>
+                <w:color w:val="000000"/>
+                <w:lang w:val="en-US" w:eastAsia="zh-CN"/>
+              </w:rPr>
+            </w:pPr>
+            <w:r>
+              <w:rPr>
+                <w:rFonts w:hint="eastAsia" w:cs="Times New Roman"/>
+                <w:b w:val="0"/>
+                <w:color w:val="000000"/>
+                <w:lang w:val="en-US" w:eastAsia="zh-CN"/>
+              </w:rPr>
+              <w:t>错误/警告卡片展示</w:t>
+            </w:r>
+          </w:p>
+        </w:tc>
+      </w:tr>
+      <w:tr>
+        <w:tblPrEx>
+          <w:tblBorders>
+            <w:top w:val="none" w:color="auto" w:sz="0" w:space="0"/>
+            <w:left w:val="none" w:color="auto" w:sz="0" w:space="0"/>
+            <w:bottom w:val="none" w:color="auto" w:sz="0" w:space="0"/>
+            <w:right w:val="none" w:color="auto" w:sz="0" w:space="0"/>
+            <w:insideH w:val="none" w:color="auto" w:sz="0" w:space="0"/>
+            <w:insideV w:val="none" w:color="auto" w:sz="0" w:space="0"/>
+          </w:tblBorders>
+          <w:tblCellMar>
+            <w:top w:w="15" w:type="dxa"/>
+            <w:left w:w="15" w:type="dxa"/>
+            <w:bottom w:w="15" w:type="dxa"/>
+            <w:right w:w="15" w:type="dxa"/>
+          </w:tblCellMar>
+        </w:tblPrEx>
+        <w:trPr>
+          <w:jc w:val="center"/>
+        </w:trPr>
+        <w:tc>
+          <w:tcPr>
+            <w:tcW w:w="0" w:type="auto"/>
+            <w:shd w:val="clear" w:color="auto" w:fill="FFFFFF"/>
+            <w:tcMar>
+              <w:top w:w="50" w:type="dxa"/>
+              <w:left w:w="100" w:type="dxa"/>
+              <w:bottom w:w="50" w:type="dxa"/>
+              <w:right w:w="100" w:type="dxa"/>
+            </w:tcMar>
+            <w:vAlign w:val="center"/>
+          </w:tcPr>
+          <w:p>
+            <w:pPr>
+              <w:ind w:firstLine="420" w:firstLineChars="200"/>
+              <w:jc w:val="both"/>
+              <w:rPr>
+                <w:rFonts w:hint="eastAsia" w:cs="Times New Roman"/>
+                <w:b w:val="0"/>
+                <w:color w:val="000000"/>
+                <w:lang w:val="en-US" w:eastAsia="zh-CN"/>
+              </w:rPr>
+            </w:pPr>
+            <w:r>
+              <w:rPr>
+                <w:rFonts w:hint="eastAsia" w:cs="Times New Roman"/>
+                <w:b w:val="0"/>
+                <w:color w:val="000000"/>
+                <w:lang w:val="en-US" w:eastAsia="zh-CN"/>
+              </w:rPr>
+              <w:t>通用</w:t>
+            </w:r>
+          </w:p>
+        </w:tc>
+        <w:tc>
+          <w:tcPr>
+            <w:tcW w:w="0" w:type="auto"/>
+            <w:shd w:val="clear" w:color="auto" w:fill="FFFFFF"/>
+            <w:tcMar>
+              <w:top w:w="50" w:type="dxa"/>
+              <w:left w:w="100" w:type="dxa"/>
+              <w:bottom w:w="50" w:type="dxa"/>
+              <w:right w:w="100" w:type="dxa"/>
+            </w:tcMar>
+            <w:vAlign w:val="center"/>
+          </w:tcPr>
+          <w:p>
+            <w:pPr>
+              <w:ind w:firstLine="420" w:firstLineChars="200"/>
+              <w:jc w:val="both"/>
+              <w:rPr>
+                <w:rFonts w:hint="eastAsia" w:cs="Times New Roman"/>
+                <w:b w:val="0"/>
+                <w:color w:val="000000"/>
+                <w:lang w:val="en-US" w:eastAsia="zh-CN"/>
+              </w:rPr>
+            </w:pPr>
+            <w:r>
+              <w:rPr>
+                <w:rFonts w:hint="eastAsia" w:cs="Times New Roman"/>
+                <w:b w:val="0"/>
+                <w:color w:val="000000"/>
+                <w:lang w:val="en-US" w:eastAsia="zh-CN"/>
+              </w:rPr>
+              <w:t>AST 节点统计</w:t>
+            </w:r>
+          </w:p>
+        </w:tc>
+      </w:tr>
+      <w:tr>
+        <w:tblPrEx>
+          <w:tblBorders>
+            <w:top w:val="none" w:color="auto" w:sz="0" w:space="0"/>
+            <w:left w:val="none" w:color="auto" w:sz="0" w:space="0"/>
+            <w:bottom w:val="none" w:color="auto" w:sz="0" w:space="0"/>
+            <w:right w:val="none" w:color="auto" w:sz="0" w:space="0"/>
+            <w:insideH w:val="none" w:color="auto" w:sz="0" w:space="0"/>
+            <w:insideV w:val="none" w:color="auto" w:sz="0" w:space="0"/>
+          </w:tblBorders>
+          <w:shd w:val="clear"/>
+          <w:tblCellMar>
+            <w:top w:w="15" w:type="dxa"/>
+            <w:left w:w="15" w:type="dxa"/>
+            <w:bottom w:w="15" w:type="dxa"/>
+            <w:right w:w="15" w:type="dxa"/>
+          </w:tblCellMar>
+        </w:tblPrEx>
+        <w:trPr>
+          <w:jc w:val="center"/>
+        </w:trPr>
+        <w:tc>
+          <w:tcPr>
+            <w:tcW w:w="0" w:type="auto"/>
+            <w:shd w:val="clear" w:color="auto" w:fill="FFFFFF"/>
+            <w:tcMar>
+              <w:top w:w="50" w:type="dxa"/>
+              <w:left w:w="100" w:type="dxa"/>
+              <w:bottom w:w="50" w:type="dxa"/>
+              <w:right w:w="100" w:type="dxa"/>
+            </w:tcMar>
+            <w:vAlign w:val="center"/>
+          </w:tcPr>
+          <w:p>
+            <w:pPr>
+              <w:ind w:firstLine="420" w:firstLineChars="200"/>
+              <w:jc w:val="both"/>
+              <w:rPr>
+                <w:rFonts w:hint="eastAsia" w:cs="Times New Roman"/>
+                <w:b w:val="0"/>
+                <w:color w:val="000000"/>
+                <w:lang w:val="en-US" w:eastAsia="zh-CN"/>
+              </w:rPr>
+            </w:pPr>
+            <w:r>
+              <w:rPr>
+                <w:rFonts w:hint="eastAsia" w:cs="Times New Roman"/>
+                <w:b w:val="0"/>
+                <w:color w:val="000000"/>
+                <w:lang w:val="en-US" w:eastAsia="zh-CN"/>
+              </w:rPr>
+              <w:t>通用</w:t>
+            </w:r>
+          </w:p>
+        </w:tc>
+        <w:tc>
+          <w:tcPr>
+            <w:tcW w:w="0" w:type="auto"/>
+            <w:shd w:val="clear" w:color="auto" w:fill="FFFFFF"/>
+            <w:tcMar>
+              <w:top w:w="50" w:type="dxa"/>
+              <w:left w:w="100" w:type="dxa"/>
+              <w:bottom w:w="50" w:type="dxa"/>
+              <w:right w:w="100" w:type="dxa"/>
+            </w:tcMar>
+            <w:vAlign w:val="center"/>
+          </w:tcPr>
+          <w:p>
+            <w:pPr>
+              <w:ind w:firstLine="420" w:firstLineChars="200"/>
+              <w:jc w:val="both"/>
+              <w:rPr>
+                <w:rFonts w:hint="eastAsia" w:cs="Times New Roman"/>
+                <w:b w:val="0"/>
+                <w:color w:val="000000"/>
+                <w:lang w:val="en-US" w:eastAsia="zh-CN"/>
+              </w:rPr>
+            </w:pPr>
+            <w:r>
+              <w:rPr>
+                <w:rFonts w:hint="eastAsia" w:cs="Times New Roman"/>
+                <w:b w:val="0"/>
+                <w:color w:val="000000"/>
+                <w:lang w:val="en-US" w:eastAsia="zh-CN"/>
+              </w:rPr>
+              <w:t>节点属性详情面板</w:t>
+            </w:r>
+          </w:p>
+        </w:tc>
+      </w:tr>
+      <w:tr>
+        <w:tblPrEx>
+          <w:tblBorders>
+            <w:top w:val="none" w:color="auto" w:sz="0" w:space="0"/>
+            <w:left w:val="none" w:color="auto" w:sz="0" w:space="0"/>
+            <w:bottom w:val="none" w:color="auto" w:sz="0" w:space="0"/>
+            <w:right w:val="none" w:color="auto" w:sz="0" w:space="0"/>
+            <w:insideH w:val="none" w:color="auto" w:sz="0" w:space="0"/>
+            <w:insideV w:val="none" w:color="auto" w:sz="0" w:space="0"/>
+          </w:tblBorders>
+          <w:tblCellMar>
+            <w:top w:w="15" w:type="dxa"/>
+            <w:left w:w="15" w:type="dxa"/>
+            <w:bottom w:w="15" w:type="dxa"/>
+            <w:right w:w="15" w:type="dxa"/>
+          </w:tblCellMar>
+        </w:tblPrEx>
+        <w:trPr>
+          <w:jc w:val="center"/>
+        </w:trPr>
+        <w:tc>
+          <w:tcPr>
+            <w:tcW w:w="0" w:type="auto"/>
+            <w:tcBorders>
+              <w:bottom w:val="single" w:color="000000" w:sz="12" w:space="0"/>
+            </w:tcBorders>
+            <w:shd w:val="clear" w:color="auto" w:fill="FFFFFF"/>
+            <w:tcMar>
+              <w:top w:w="50" w:type="dxa"/>
+              <w:left w:w="100" w:type="dxa"/>
+              <w:bottom w:w="50" w:type="dxa"/>
+              <w:right w:w="100" w:type="dxa"/>
+            </w:tcMar>
+            <w:vAlign w:val="center"/>
+          </w:tcPr>
+          <w:p>
+            <w:pPr>
+              <w:ind w:firstLine="420" w:firstLineChars="200"/>
+              <w:jc w:val="both"/>
+              <w:rPr>
+                <w:rFonts w:hint="eastAsia" w:cs="Times New Roman"/>
+                <w:b w:val="0"/>
+                <w:color w:val="000000"/>
+                <w:lang w:val="en-US" w:eastAsia="zh-CN"/>
+              </w:rPr>
+            </w:pPr>
+            <w:r>
+              <w:rPr>
+                <w:rFonts w:hint="eastAsia" w:cs="Times New Roman"/>
+                <w:b w:val="0"/>
+                <w:color w:val="000000"/>
+                <w:lang w:val="en-US" w:eastAsia="zh-CN"/>
+              </w:rPr>
+              <w:t>通用</w:t>
+            </w:r>
+          </w:p>
+        </w:tc>
+        <w:tc>
+          <w:tcPr>
+            <w:tcW w:w="0" w:type="auto"/>
+            <w:tcBorders>
+              <w:bottom w:val="single" w:color="000000" w:sz="12" w:space="0"/>
+            </w:tcBorders>
+            <w:shd w:val="clear" w:color="auto" w:fill="FFFFFF"/>
+            <w:tcMar>
+              <w:top w:w="50" w:type="dxa"/>
+              <w:left w:w="100" w:type="dxa"/>
+              <w:bottom w:w="50" w:type="dxa"/>
+              <w:right w:w="100" w:type="dxa"/>
+            </w:tcMar>
+            <w:vAlign w:val="center"/>
+          </w:tcPr>
+          <w:p>
+            <w:pPr>
+              <w:ind w:firstLine="420" w:firstLineChars="200"/>
+              <w:jc w:val="both"/>
+              <w:rPr>
+                <w:rFonts w:hint="eastAsia" w:cs="Times New Roman"/>
+                <w:b w:val="0"/>
+                <w:color w:val="000000"/>
+                <w:lang w:val="en-US" w:eastAsia="zh-CN"/>
+              </w:rPr>
+            </w:pPr>
+            <w:r>
+              <w:rPr>
+                <w:rFonts w:hint="eastAsia" w:cs="Times New Roman"/>
+                <w:b w:val="0"/>
+                <w:color w:val="000000"/>
+                <w:lang w:val="en-US" w:eastAsia="zh-CN"/>
+              </w:rPr>
+              <w:t>统计概览（Token/AST/IR/错误数）</w:t>
+            </w:r>
+          </w:p>
+        </w:tc>
+      </w:tr>
+    </w:tbl>
+    <w:p>
+      <w:pPr>
+        <w:ind w:firstLine="840" w:firstLineChars="400"/>
+        <w:jc w:val="both"/>
+        <w:rPr>
+          <w:rFonts w:hint="eastAsia" w:cs="Times New Roman"/>
+          <w:lang w:val="en-US" w:eastAsia="zh-CN"/>
+        </w:rPr>
+      </w:pPr>
+      <w:r>
+        <w:rPr>
+          <w:rFonts w:hint="eastAsia" w:cs="Times New Roman"/>
+          <w:lang w:val="en-US" w:eastAsia="zh-CN"/>
+        </w:rPr>
+        <w:t>其主要技术栈为：</w:t>
+      </w:r>
+    </w:p>
+    <w:tbl>
+      <w:tblPr>
+        <w:tblW w:w="0" w:type="auto"/>
+        <w:tblInd w:w="0" w:type="dxa"/>
+        <w:tblBorders>
+          <w:top w:val="none" w:color="auto" w:sz="0" w:space="0"/>
+          <w:left w:val="none" w:color="auto" w:sz="0" w:space="0"/>
+          <w:bottom w:val="none" w:color="auto" w:sz="0" w:space="0"/>
+          <w:right w:val="none" w:color="auto" w:sz="0" w:space="0"/>
+          <w:insideH w:val="none" w:color="auto" w:sz="0" w:space="0"/>
+          <w:insideV w:val="none" w:color="auto" w:sz="0" w:space="0"/>
+        </w:tblBorders>
+        <w:shd w:val="clear"/>
+        <w:tblLayout w:type="autofit"/>
+        <w:tblCellMar>
+          <w:top w:w="15" w:type="dxa"/>
+          <w:left w:w="15" w:type="dxa"/>
+          <w:bottom w:w="15" w:type="dxa"/>
+          <w:right w:w="15" w:type="dxa"/>
+        </w:tblCellMar>
+      </w:tblPr>
+      <w:tblGrid>
+        <w:gridCol w:w="1525"/>
+        <w:gridCol w:w="2790"/>
+        <w:gridCol w:w="4027"/>
+      </w:tblGrid>
+      <w:tr>
+        <w:tblPrEx>
+          <w:tblBorders>
+            <w:top w:val="none" w:color="auto" w:sz="0" w:space="0"/>
+            <w:left w:val="none" w:color="auto" w:sz="0" w:space="0"/>
+            <w:bottom w:val="none" w:color="auto" w:sz="0" w:space="0"/>
+            <w:right w:val="none" w:color="auto" w:sz="0" w:space="0"/>
+            <w:insideH w:val="none" w:color="auto" w:sz="0" w:space="0"/>
+            <w:insideV w:val="none" w:color="auto" w:sz="0" w:space="0"/>
+          </w:tblBorders>
+          <w:shd w:val="clear"/>
+          <w:tblCellMar>
+            <w:top w:w="15" w:type="dxa"/>
+            <w:left w:w="15" w:type="dxa"/>
+            <w:bottom w:w="15" w:type="dxa"/>
+            <w:right w:w="15" w:type="dxa"/>
+          </w:tblCellMar>
+        </w:tblPrEx>
+        <w:tc>
+          <w:tcPr>
+            <w:tcW w:w="0" w:type="auto"/>
+            <w:tcBorders>
+              <w:top w:val="single" w:color="000000" w:sz="12" w:space="0"/>
+              <w:bottom w:val="single" w:color="000000" w:sz="4" w:space="0"/>
+              <w:tl2br w:val="nil"/>
+            </w:tcBorders>
+            <w:shd w:val="clear" w:color="auto" w:fill="FFFFFF"/>
+            <w:tcMar>
+              <w:top w:w="50" w:type="dxa"/>
+              <w:left w:w="100" w:type="dxa"/>
+              <w:bottom w:w="50" w:type="dxa"/>
+              <w:right w:w="100" w:type="dxa"/>
+            </w:tcMar>
+            <w:vAlign w:val="center"/>
+          </w:tcPr>
+          <w:p>
+            <w:pPr>
+              <w:ind w:firstLine="420" w:firstLineChars="200"/>
+              <w:jc w:val="center"/>
+              <w:rPr>
+                <w:rFonts w:hint="default" w:cs="Times New Roman"/>
+                <w:b w:val="0"/>
+                <w:color w:val="000000"/>
+                <w:lang w:val="en-US" w:eastAsia="zh-CN"/>
+              </w:rPr>
+            </w:pPr>
+            <w:r>
+              <w:rPr>
+                <w:rFonts w:hint="default" w:cs="Times New Roman"/>
+                <w:b w:val="0"/>
+                <w:color w:val="000000"/>
+                <w:lang w:val="en-US" w:eastAsia="zh-CN"/>
+              </w:rPr>
+              <w:t>后端语言</w:t>
+            </w:r>
+          </w:p>
+        </w:tc>
+        <w:tc>
+          <w:tcPr>
+            <w:tcW w:w="0" w:type="auto"/>
+            <w:tcBorders>
+              <w:top w:val="single" w:color="000000" w:sz="12" w:space="0"/>
+              <w:bottom w:val="single" w:color="000000" w:sz="4" w:space="0"/>
+            </w:tcBorders>
+            <w:shd w:val="clear" w:color="auto" w:fill="FFFFFF"/>
+            <w:tcMar>
+              <w:top w:w="50" w:type="dxa"/>
+              <w:left w:w="100" w:type="dxa"/>
+              <w:bottom w:w="50" w:type="dxa"/>
+              <w:right w:w="100" w:type="dxa"/>
+            </w:tcMar>
+            <w:vAlign w:val="center"/>
+          </w:tcPr>
+          <w:p>
+            <w:pPr>
+              <w:ind w:firstLine="420" w:firstLineChars="200"/>
+              <w:jc w:val="center"/>
+              <w:rPr>
+                <w:rFonts w:hint="default" w:cs="Times New Roman"/>
+                <w:b w:val="0"/>
+                <w:color w:val="000000"/>
+                <w:lang w:val="en-US" w:eastAsia="zh-CN"/>
+              </w:rPr>
+            </w:pPr>
+            <w:r>
+              <w:rPr>
+                <w:rFonts w:hint="default" w:cs="Times New Roman"/>
+                <w:b w:val="0"/>
+                <w:color w:val="000000"/>
+                <w:lang w:val="en-US" w:eastAsia="zh-CN"/>
+              </w:rPr>
+              <w:t>Python 3</w:t>
+            </w:r>
+          </w:p>
+        </w:tc>
+        <w:tc>
+          <w:tcPr>
+            <w:tcW w:w="0" w:type="auto"/>
+            <w:tcBorders>
+              <w:top w:val="single" w:color="000000" w:sz="12" w:space="0"/>
+              <w:bottom w:val="single" w:color="000000" w:sz="4" w:space="0"/>
+            </w:tcBorders>
+            <w:shd w:val="clear" w:color="auto" w:fill="FFFFFF"/>
+            <w:tcMar>
+              <w:top w:w="50" w:type="dxa"/>
+              <w:left w:w="100" w:type="dxa"/>
+              <w:bottom w:w="50" w:type="dxa"/>
+              <w:right w:w="100" w:type="dxa"/>
+            </w:tcMar>
+            <w:vAlign w:val="center"/>
+          </w:tcPr>
+          <w:p>
+            <w:pPr>
+              <w:ind w:firstLine="420" w:firstLineChars="200"/>
+              <w:jc w:val="center"/>
+              <w:rPr>
+                <w:rFonts w:hint="default" w:cs="Times New Roman"/>
+                <w:b w:val="0"/>
+                <w:color w:val="000000"/>
+                <w:lang w:val="en-US" w:eastAsia="zh-CN"/>
+              </w:rPr>
+            </w:pPr>
+            <w:r>
+              <w:rPr>
+                <w:rFonts w:hint="default" w:cs="Times New Roman"/>
+                <w:b w:val="0"/>
+                <w:color w:val="000000"/>
+                <w:lang w:val="en-US" w:eastAsia="zh-CN"/>
+              </w:rPr>
+              <w:t>编译器逻辑与可视化逻辑</w:t>
+            </w:r>
+          </w:p>
+        </w:tc>
+      </w:tr>
+      <w:tr>
+        <w:tblPrEx>
+          <w:tblBorders>
+            <w:top w:val="none" w:color="auto" w:sz="0" w:space="0"/>
+            <w:left w:val="none" w:color="auto" w:sz="0" w:space="0"/>
+            <w:bottom w:val="none" w:color="auto" w:sz="0" w:space="0"/>
+            <w:right w:val="none" w:color="auto" w:sz="0" w:space="0"/>
+            <w:insideH w:val="none" w:color="auto" w:sz="0" w:space="0"/>
+            <w:insideV w:val="none" w:color="auto" w:sz="0" w:space="0"/>
+          </w:tblBorders>
+          <w:shd w:val="clear"/>
+          <w:tblCellMar>
+            <w:top w:w="15" w:type="dxa"/>
+            <w:left w:w="15" w:type="dxa"/>
+            <w:bottom w:w="15" w:type="dxa"/>
+            <w:right w:w="15" w:type="dxa"/>
+          </w:tblCellMar>
+        </w:tblPrEx>
+        <w:tc>
+          <w:tcPr>
+            <w:tcW w:w="0" w:type="auto"/>
+            <w:tcBorders>
+              <w:top w:val="single" w:color="000000" w:sz="4" w:space="0"/>
+            </w:tcBorders>
+            <w:shd w:val="clear" w:color="auto" w:fill="FFFFFF"/>
+            <w:tcMar>
+              <w:top w:w="50" w:type="dxa"/>
+              <w:left w:w="100" w:type="dxa"/>
+              <w:bottom w:w="50" w:type="dxa"/>
+              <w:right w:w="100" w:type="dxa"/>
+            </w:tcMar>
+            <w:vAlign w:val="center"/>
+          </w:tcPr>
+          <w:p>
+            <w:pPr>
+              <w:ind w:firstLine="420" w:firstLineChars="200"/>
+              <w:jc w:val="center"/>
+              <w:rPr>
+                <w:rFonts w:hint="default" w:cs="Times New Roman"/>
+                <w:b w:val="0"/>
+                <w:color w:val="000000"/>
+                <w:lang w:val="en-US" w:eastAsia="zh-CN"/>
+              </w:rPr>
+            </w:pPr>
+            <w:r>
+              <w:rPr>
+                <w:rFonts w:hint="default" w:cs="Times New Roman"/>
+                <w:b w:val="0"/>
+                <w:color w:val="000000"/>
+                <w:lang w:val="en-US" w:eastAsia="zh-CN"/>
+              </w:rPr>
+              <w:t>Web 框架</w:t>
+            </w:r>
+          </w:p>
+        </w:tc>
+        <w:tc>
+          <w:tcPr>
+            <w:tcW w:w="0" w:type="auto"/>
+            <w:tcBorders>
+              <w:top w:val="single" w:color="000000" w:sz="4" w:space="0"/>
+            </w:tcBorders>
+            <w:shd w:val="clear" w:color="auto" w:fill="FFFFFF"/>
+            <w:tcMar>
+              <w:top w:w="50" w:type="dxa"/>
+              <w:left w:w="100" w:type="dxa"/>
+              <w:bottom w:w="50" w:type="dxa"/>
+              <w:right w:w="100" w:type="dxa"/>
+            </w:tcMar>
+            <w:vAlign w:val="center"/>
+          </w:tcPr>
+          <w:p>
+            <w:pPr>
+              <w:ind w:firstLine="420" w:firstLineChars="200"/>
+              <w:jc w:val="center"/>
+              <w:rPr>
+                <w:rFonts w:hint="default" w:cs="Times New Roman"/>
+                <w:b w:val="0"/>
+                <w:color w:val="000000"/>
+                <w:lang w:val="en-US" w:eastAsia="zh-CN"/>
+              </w:rPr>
+            </w:pPr>
+            <w:r>
+              <w:rPr>
+                <w:rFonts w:hint="default" w:cs="Times New Roman"/>
+                <w:b w:val="0"/>
+                <w:color w:val="000000"/>
+                <w:lang w:val="en-US" w:eastAsia="zh-CN"/>
+              </w:rPr>
+              <w:t>Flask</w:t>
+            </w:r>
+          </w:p>
+        </w:tc>
+        <w:tc>
+          <w:tcPr>
+            <w:tcW w:w="0" w:type="auto"/>
+            <w:tcBorders>
+              <w:top w:val="single" w:color="000000" w:sz="4" w:space="0"/>
+            </w:tcBorders>
+            <w:shd w:val="clear" w:color="auto" w:fill="FFFFFF"/>
+            <w:tcMar>
+              <w:top w:w="50" w:type="dxa"/>
+              <w:left w:w="100" w:type="dxa"/>
+              <w:bottom w:w="50" w:type="dxa"/>
+              <w:right w:w="100" w:type="dxa"/>
+            </w:tcMar>
+            <w:vAlign w:val="center"/>
+          </w:tcPr>
+          <w:p>
+            <w:pPr>
+              <w:ind w:firstLine="420" w:firstLineChars="200"/>
+              <w:jc w:val="center"/>
+              <w:rPr>
+                <w:rFonts w:hint="default" w:cs="Times New Roman"/>
+                <w:b w:val="0"/>
+                <w:color w:val="000000"/>
+                <w:lang w:val="en-US" w:eastAsia="zh-CN"/>
+              </w:rPr>
+            </w:pPr>
+            <w:r>
+              <w:rPr>
+                <w:rFonts w:hint="default" w:cs="Times New Roman"/>
+                <w:b w:val="0"/>
+                <w:color w:val="000000"/>
+                <w:lang w:val="en-US" w:eastAsia="zh-CN"/>
+              </w:rPr>
+              <w:t>REST API 后端</w:t>
+            </w:r>
+          </w:p>
+        </w:tc>
+      </w:tr>
+      <w:tr>
+        <w:tblPrEx>
+          <w:tblBorders>
+            <w:top w:val="none" w:color="auto" w:sz="0" w:space="0"/>
+            <w:left w:val="none" w:color="auto" w:sz="0" w:space="0"/>
+            <w:bottom w:val="none" w:color="auto" w:sz="0" w:space="0"/>
+            <w:right w:val="none" w:color="auto" w:sz="0" w:space="0"/>
+            <w:insideH w:val="none" w:color="auto" w:sz="0" w:space="0"/>
+            <w:insideV w:val="none" w:color="auto" w:sz="0" w:space="0"/>
+          </w:tblBorders>
+          <w:shd w:val="clear"/>
+          <w:tblCellMar>
+            <w:top w:w="15" w:type="dxa"/>
+            <w:left w:w="15" w:type="dxa"/>
+            <w:bottom w:w="15" w:type="dxa"/>
+            <w:right w:w="15" w:type="dxa"/>
+          </w:tblCellMar>
+        </w:tblPrEx>
+        <w:tc>
+          <w:tcPr>
+            <w:tcW w:w="0" w:type="auto"/>
+            <w:shd w:val="clear" w:color="auto" w:fill="FFFFFF"/>
+            <w:tcMar>
+              <w:top w:w="50" w:type="dxa"/>
+              <w:left w:w="100" w:type="dxa"/>
+              <w:bottom w:w="50" w:type="dxa"/>
+              <w:right w:w="100" w:type="dxa"/>
+            </w:tcMar>
+            <w:vAlign w:val="center"/>
+          </w:tcPr>
+          <w:p>
+            <w:pPr>
+              <w:ind w:firstLine="420" w:firstLineChars="200"/>
+              <w:jc w:val="center"/>
+              <w:rPr>
+                <w:rFonts w:hint="default" w:cs="Times New Roman"/>
+                <w:b w:val="0"/>
+                <w:color w:val="000000"/>
+                <w:lang w:val="en-US" w:eastAsia="zh-CN"/>
+              </w:rPr>
+            </w:pPr>
+            <w:r>
+              <w:rPr>
+                <w:rFonts w:hint="default" w:cs="Times New Roman"/>
+                <w:b w:val="0"/>
+                <w:color w:val="000000"/>
+                <w:lang w:val="en-US" w:eastAsia="zh-CN"/>
+              </w:rPr>
+              <w:t>前端样式</w:t>
+            </w:r>
+          </w:p>
+        </w:tc>
+        <w:tc>
+          <w:tcPr>
+            <w:tcW w:w="0" w:type="auto"/>
+            <w:shd w:val="clear" w:color="auto" w:fill="FFFFFF"/>
+            <w:tcMar>
+              <w:top w:w="50" w:type="dxa"/>
+              <w:left w:w="100" w:type="dxa"/>
+              <w:bottom w:w="50" w:type="dxa"/>
+              <w:right w:w="100" w:type="dxa"/>
+            </w:tcMar>
+            <w:vAlign w:val="center"/>
+          </w:tcPr>
+          <w:p>
+            <w:pPr>
+              <w:ind w:firstLine="420" w:firstLineChars="200"/>
+              <w:jc w:val="center"/>
+              <w:rPr>
+                <w:rFonts w:hint="default" w:cs="Times New Roman"/>
+                <w:b w:val="0"/>
+                <w:color w:val="000000"/>
+                <w:lang w:val="en-US" w:eastAsia="zh-CN"/>
+              </w:rPr>
+            </w:pPr>
+            <w:r>
+              <w:rPr>
+                <w:rFonts w:hint="default" w:cs="Times New Roman"/>
+                <w:b w:val="0"/>
+                <w:color w:val="000000"/>
+                <w:lang w:val="en-US" w:eastAsia="zh-CN"/>
+              </w:rPr>
+              <w:t>Tailwind CSS（CDN）</w:t>
+            </w:r>
+          </w:p>
+        </w:tc>
+        <w:tc>
+          <w:tcPr>
+            <w:tcW w:w="0" w:type="auto"/>
+            <w:shd w:val="clear" w:color="auto" w:fill="FFFFFF"/>
+            <w:tcMar>
+              <w:top w:w="50" w:type="dxa"/>
+              <w:left w:w="100" w:type="dxa"/>
+              <w:bottom w:w="50" w:type="dxa"/>
+              <w:right w:w="100" w:type="dxa"/>
+            </w:tcMar>
+            <w:vAlign w:val="center"/>
+          </w:tcPr>
+          <w:p>
+            <w:pPr>
+              <w:ind w:firstLine="420" w:firstLineChars="200"/>
+              <w:jc w:val="center"/>
+              <w:rPr>
+                <w:rFonts w:hint="default" w:cs="Times New Roman"/>
+                <w:b w:val="0"/>
+                <w:color w:val="000000"/>
+                <w:lang w:val="en-US" w:eastAsia="zh-CN"/>
+              </w:rPr>
+            </w:pPr>
+            <w:r>
+              <w:rPr>
+                <w:rFonts w:hint="default" w:cs="Times New Roman"/>
+                <w:b w:val="0"/>
+                <w:color w:val="000000"/>
+                <w:lang w:val="en-US" w:eastAsia="zh-CN"/>
+              </w:rPr>
+              <w:t>响应式布局与 Material Design 3 风格</w:t>
+            </w:r>
+          </w:p>
+        </w:tc>
+      </w:tr>
+      <w:tr>
+        <w:tblPrEx>
+          <w:tblBorders>
+            <w:top w:val="none" w:color="auto" w:sz="0" w:space="0"/>
+            <w:left w:val="none" w:color="auto" w:sz="0" w:space="0"/>
+            <w:bottom w:val="none" w:color="auto" w:sz="0" w:space="0"/>
+            <w:right w:val="none" w:color="auto" w:sz="0" w:space="0"/>
+            <w:insideH w:val="none" w:color="auto" w:sz="0" w:space="0"/>
+            <w:insideV w:val="none" w:color="auto" w:sz="0" w:space="0"/>
+          </w:tblBorders>
+          <w:shd w:val="clear"/>
+          <w:tblCellMar>
+            <w:top w:w="15" w:type="dxa"/>
+            <w:left w:w="15" w:type="dxa"/>
+            <w:bottom w:w="15" w:type="dxa"/>
+            <w:right w:w="15" w:type="dxa"/>
+          </w:tblCellMar>
+        </w:tblPrEx>
+        <w:tc>
+          <w:tcPr>
+            <w:tcW w:w="0" w:type="auto"/>
+            <w:shd w:val="clear" w:color="auto" w:fill="FFFFFF"/>
+            <w:tcMar>
+              <w:top w:w="50" w:type="dxa"/>
+              <w:left w:w="100" w:type="dxa"/>
+              <w:bottom w:w="50" w:type="dxa"/>
+              <w:right w:w="100" w:type="dxa"/>
+            </w:tcMar>
+            <w:vAlign w:val="center"/>
+          </w:tcPr>
+          <w:p>
+            <w:pPr>
+              <w:ind w:firstLine="420" w:firstLineChars="200"/>
+              <w:jc w:val="center"/>
+              <w:rPr>
+                <w:rFonts w:hint="default" w:cs="Times New Roman"/>
+                <w:b w:val="0"/>
+                <w:color w:val="000000"/>
+                <w:lang w:val="en-US" w:eastAsia="zh-CN"/>
+              </w:rPr>
+            </w:pPr>
+            <w:r>
+              <w:rPr>
+                <w:rFonts w:hint="default" w:cs="Times New Roman"/>
+                <w:b w:val="0"/>
+                <w:color w:val="000000"/>
+                <w:lang w:val="en-US" w:eastAsia="zh-CN"/>
+              </w:rPr>
+              <w:t>前端图标</w:t>
+            </w:r>
+          </w:p>
+        </w:tc>
+        <w:tc>
+          <w:tcPr>
+            <w:tcW w:w="0" w:type="auto"/>
+            <w:shd w:val="clear" w:color="auto" w:fill="FFFFFF"/>
+            <w:tcMar>
+              <w:top w:w="50" w:type="dxa"/>
+              <w:left w:w="100" w:type="dxa"/>
+              <w:bottom w:w="50" w:type="dxa"/>
+              <w:right w:w="100" w:type="dxa"/>
+            </w:tcMar>
+            <w:vAlign w:val="center"/>
+          </w:tcPr>
+          <w:p>
+            <w:pPr>
+              <w:ind w:firstLine="420" w:firstLineChars="200"/>
+              <w:jc w:val="center"/>
+              <w:rPr>
+                <w:rFonts w:hint="default" w:cs="Times New Roman"/>
+                <w:b w:val="0"/>
+                <w:color w:val="000000"/>
+                <w:lang w:val="en-US" w:eastAsia="zh-CN"/>
+              </w:rPr>
+            </w:pPr>
+            <w:r>
+              <w:rPr>
+                <w:rFonts w:hint="default" w:cs="Times New Roman"/>
+                <w:b w:val="0"/>
+                <w:color w:val="000000"/>
+                <w:lang w:val="en-US" w:eastAsia="zh-CN"/>
+              </w:rPr>
+              <w:t>Google Material Symbols</w:t>
+            </w:r>
+          </w:p>
+        </w:tc>
+        <w:tc>
+          <w:tcPr>
+            <w:tcW w:w="0" w:type="auto"/>
+            <w:shd w:val="clear" w:color="auto" w:fill="FFFFFF"/>
+            <w:tcMar>
+              <w:top w:w="50" w:type="dxa"/>
+              <w:left w:w="100" w:type="dxa"/>
+              <w:bottom w:w="50" w:type="dxa"/>
+              <w:right w:w="100" w:type="dxa"/>
+            </w:tcMar>
+            <w:vAlign w:val="center"/>
+          </w:tcPr>
+          <w:p>
+            <w:pPr>
+              <w:ind w:firstLine="420" w:firstLineChars="200"/>
+              <w:jc w:val="center"/>
+              <w:rPr>
+                <w:rFonts w:hint="default" w:cs="Times New Roman"/>
+                <w:b w:val="0"/>
+                <w:color w:val="000000"/>
+                <w:lang w:val="en-US" w:eastAsia="zh-CN"/>
+              </w:rPr>
+            </w:pPr>
+            <w:r>
+              <w:rPr>
+                <w:rFonts w:hint="default" w:cs="Times New Roman"/>
+                <w:b w:val="0"/>
+                <w:color w:val="000000"/>
+                <w:lang w:val="en-US" w:eastAsia="zh-CN"/>
+              </w:rPr>
+              <w:t>界面图标</w:t>
+            </w:r>
+          </w:p>
+        </w:tc>
+      </w:tr>
+      <w:tr>
+        <w:tblPrEx>
+          <w:tblBorders>
+            <w:top w:val="none" w:color="auto" w:sz="0" w:space="0"/>
+            <w:left w:val="none" w:color="auto" w:sz="0" w:space="0"/>
+            <w:bottom w:val="none" w:color="auto" w:sz="0" w:space="0"/>
+            <w:right w:val="none" w:color="auto" w:sz="0" w:space="0"/>
+            <w:insideH w:val="none" w:color="auto" w:sz="0" w:space="0"/>
+            <w:insideV w:val="none" w:color="auto" w:sz="0" w:space="0"/>
+          </w:tblBorders>
+          <w:tblCellMar>
+            <w:top w:w="15" w:type="dxa"/>
+            <w:left w:w="15" w:type="dxa"/>
+            <w:bottom w:w="15" w:type="dxa"/>
+            <w:right w:w="15" w:type="dxa"/>
+          </w:tblCellMar>
+        </w:tblPrEx>
+        <w:tc>
+          <w:tcPr>
+            <w:tcW w:w="0" w:type="auto"/>
+            <w:shd w:val="clear" w:color="auto" w:fill="FFFFFF"/>
+            <w:tcMar>
+              <w:top w:w="50" w:type="dxa"/>
+              <w:left w:w="100" w:type="dxa"/>
+              <w:bottom w:w="50" w:type="dxa"/>
+              <w:right w:w="100" w:type="dxa"/>
+            </w:tcMar>
+            <w:vAlign w:val="center"/>
+          </w:tcPr>
+          <w:p>
+            <w:pPr>
+              <w:ind w:firstLine="420" w:firstLineChars="200"/>
+              <w:jc w:val="center"/>
+              <w:rPr>
+                <w:rFonts w:hint="default" w:cs="Times New Roman"/>
+                <w:b w:val="0"/>
+                <w:color w:val="000000"/>
+                <w:lang w:val="en-US" w:eastAsia="zh-CN"/>
+              </w:rPr>
+            </w:pPr>
+            <w:r>
+              <w:rPr>
+                <w:rFonts w:hint="default" w:cs="Times New Roman"/>
+                <w:b w:val="0"/>
+                <w:color w:val="000000"/>
+                <w:lang w:val="en-US" w:eastAsia="zh-CN"/>
+              </w:rPr>
+              <w:t>前端字体</w:t>
+            </w:r>
+          </w:p>
+        </w:tc>
+        <w:tc>
+          <w:tcPr>
+            <w:tcW w:w="0" w:type="auto"/>
+            <w:shd w:val="clear" w:color="auto" w:fill="FFFFFF"/>
+            <w:tcMar>
+              <w:top w:w="50" w:type="dxa"/>
+              <w:left w:w="100" w:type="dxa"/>
+              <w:bottom w:w="50" w:type="dxa"/>
+              <w:right w:w="100" w:type="dxa"/>
+            </w:tcMar>
+            <w:vAlign w:val="center"/>
+          </w:tcPr>
+          <w:p>
+            <w:pPr>
+              <w:ind w:firstLine="420" w:firstLineChars="200"/>
+              <w:jc w:val="center"/>
+              <w:rPr>
+                <w:rFonts w:hint="default" w:cs="Times New Roman"/>
+                <w:b w:val="0"/>
+                <w:color w:val="000000"/>
+                <w:lang w:val="en-US" w:eastAsia="zh-CN"/>
+              </w:rPr>
+            </w:pPr>
+            <w:r>
+              <w:rPr>
+                <w:rFonts w:hint="default" w:cs="Times New Roman"/>
+                <w:b w:val="0"/>
+                <w:color w:val="000000"/>
+                <w:lang w:val="en-US" w:eastAsia="zh-CN"/>
+              </w:rPr>
+              <w:t>Inter + JetBrains Mono</w:t>
+            </w:r>
+          </w:p>
+        </w:tc>
+        <w:tc>
+          <w:tcPr>
+            <w:tcW w:w="0" w:type="auto"/>
+            <w:shd w:val="clear" w:color="auto" w:fill="FFFFFF"/>
+            <w:tcMar>
+              <w:top w:w="50" w:type="dxa"/>
+              <w:left w:w="100" w:type="dxa"/>
+              <w:bottom w:w="50" w:type="dxa"/>
+              <w:right w:w="100" w:type="dxa"/>
+            </w:tcMar>
+            <w:vAlign w:val="center"/>
+          </w:tcPr>
+          <w:p>
+            <w:pPr>
+              <w:ind w:firstLine="420" w:firstLineChars="200"/>
+              <w:jc w:val="center"/>
+              <w:rPr>
+                <w:rFonts w:hint="default" w:cs="Times New Roman"/>
+                <w:b w:val="0"/>
+                <w:color w:val="000000"/>
+                <w:lang w:val="en-US" w:eastAsia="zh-CN"/>
+              </w:rPr>
+            </w:pPr>
+            <w:r>
+              <w:rPr>
+                <w:rFonts w:hint="default" w:cs="Times New Roman"/>
+                <w:b w:val="0"/>
+                <w:color w:val="000000"/>
+                <w:lang w:val="en-US" w:eastAsia="zh-CN"/>
+              </w:rPr>
+              <w:t>UI 字体与等宽代码字体</w:t>
+            </w:r>
+          </w:p>
+        </w:tc>
+      </w:tr>
+      <w:tr>
+        <w:tblPrEx>
+          <w:tblBorders>
+            <w:top w:val="none" w:color="auto" w:sz="0" w:space="0"/>
+            <w:left w:val="none" w:color="auto" w:sz="0" w:space="0"/>
+            <w:bottom w:val="none" w:color="auto" w:sz="0" w:space="0"/>
+            <w:right w:val="none" w:color="auto" w:sz="0" w:space="0"/>
+            <w:insideH w:val="none" w:color="auto" w:sz="0" w:space="0"/>
+            <w:insideV w:val="none" w:color="auto" w:sz="0" w:space="0"/>
+          </w:tblBorders>
+          <w:shd w:val="clear"/>
+          <w:tblCellMar>
+            <w:top w:w="15" w:type="dxa"/>
+            <w:left w:w="15" w:type="dxa"/>
+            <w:bottom w:w="15" w:type="dxa"/>
+            <w:right w:w="15" w:type="dxa"/>
+          </w:tblCellMar>
+        </w:tblPrEx>
+        <w:tc>
+          <w:tcPr>
+            <w:tcW w:w="0" w:type="auto"/>
+            <w:shd w:val="clear" w:color="auto" w:fill="FFFFFF"/>
+            <w:tcMar>
+              <w:top w:w="50" w:type="dxa"/>
+              <w:left w:w="100" w:type="dxa"/>
+              <w:bottom w:w="50" w:type="dxa"/>
+              <w:right w:w="100" w:type="dxa"/>
+            </w:tcMar>
+            <w:vAlign w:val="center"/>
+          </w:tcPr>
+          <w:p>
+            <w:pPr>
+              <w:ind w:firstLine="420" w:firstLineChars="200"/>
+              <w:jc w:val="center"/>
+              <w:rPr>
+                <w:rFonts w:hint="default" w:cs="Times New Roman"/>
+                <w:b w:val="0"/>
+                <w:color w:val="000000"/>
+                <w:lang w:val="en-US" w:eastAsia="zh-CN"/>
+              </w:rPr>
+            </w:pPr>
+            <w:r>
+              <w:rPr>
+                <w:rFonts w:hint="default" w:cs="Times New Roman"/>
+                <w:b w:val="0"/>
+                <w:color w:val="000000"/>
+                <w:lang w:val="en-US" w:eastAsia="zh-CN"/>
+              </w:rPr>
+              <w:t>前端图表</w:t>
+            </w:r>
+          </w:p>
+        </w:tc>
+        <w:tc>
+          <w:tcPr>
+            <w:tcW w:w="0" w:type="auto"/>
+            <w:shd w:val="clear" w:color="auto" w:fill="FFFFFF"/>
+            <w:tcMar>
+              <w:top w:w="50" w:type="dxa"/>
+              <w:left w:w="100" w:type="dxa"/>
+              <w:bottom w:w="50" w:type="dxa"/>
+              <w:right w:w="100" w:type="dxa"/>
+            </w:tcMar>
+            <w:vAlign w:val="center"/>
+          </w:tcPr>
+          <w:p>
+            <w:pPr>
+              <w:ind w:firstLine="420" w:firstLineChars="200"/>
+              <w:jc w:val="center"/>
+              <w:rPr>
+                <w:rFonts w:hint="default" w:cs="Times New Roman"/>
+                <w:b w:val="0"/>
+                <w:color w:val="000000"/>
+                <w:lang w:val="en-US" w:eastAsia="zh-CN"/>
+              </w:rPr>
+            </w:pPr>
+            <w:r>
+              <w:rPr>
+                <w:rFonts w:hint="default" w:cs="Times New Roman"/>
+                <w:b w:val="0"/>
+                <w:color w:val="000000"/>
+                <w:lang w:val="en-US" w:eastAsia="zh-CN"/>
+              </w:rPr>
+              <w:t>D3.js v7（CDN）</w:t>
+            </w:r>
+          </w:p>
+        </w:tc>
+        <w:tc>
+          <w:tcPr>
+            <w:tcW w:w="0" w:type="auto"/>
+            <w:shd w:val="clear" w:color="auto" w:fill="FFFFFF"/>
+            <w:tcMar>
+              <w:top w:w="50" w:type="dxa"/>
+              <w:left w:w="100" w:type="dxa"/>
+              <w:bottom w:w="50" w:type="dxa"/>
+              <w:right w:w="100" w:type="dxa"/>
+            </w:tcMar>
+            <w:vAlign w:val="center"/>
+          </w:tcPr>
+          <w:p>
+            <w:pPr>
+              <w:ind w:firstLine="420" w:firstLineChars="200"/>
+              <w:jc w:val="center"/>
+              <w:rPr>
+                <w:rFonts w:hint="default" w:cs="Times New Roman"/>
+                <w:b w:val="0"/>
+                <w:color w:val="000000"/>
+                <w:lang w:val="en-US" w:eastAsia="zh-CN"/>
+              </w:rPr>
+            </w:pPr>
+            <w:r>
+              <w:rPr>
+                <w:rFonts w:hint="default" w:cs="Times New Roman"/>
+                <w:b w:val="0"/>
+                <w:color w:val="000000"/>
+                <w:lang w:val="en-US" w:eastAsia="zh-CN"/>
+              </w:rPr>
+              <w:t>树形可视化与交互式图形</w:t>
+            </w:r>
+          </w:p>
+        </w:tc>
+      </w:tr>
+      <w:tr>
+        <w:tblPrEx>
+          <w:tblBorders>
+            <w:top w:val="none" w:color="auto" w:sz="0" w:space="0"/>
+            <w:left w:val="none" w:color="auto" w:sz="0" w:space="0"/>
+            <w:bottom w:val="none" w:color="auto" w:sz="0" w:space="0"/>
+            <w:right w:val="none" w:color="auto" w:sz="0" w:space="0"/>
+            <w:insideH w:val="none" w:color="auto" w:sz="0" w:space="0"/>
+            <w:insideV w:val="none" w:color="auto" w:sz="0" w:space="0"/>
+          </w:tblBorders>
+          <w:shd w:val="clear"/>
+          <w:tblCellMar>
+            <w:top w:w="15" w:type="dxa"/>
+            <w:left w:w="15" w:type="dxa"/>
+            <w:bottom w:w="15" w:type="dxa"/>
+            <w:right w:w="15" w:type="dxa"/>
+          </w:tblCellMar>
+        </w:tblPrEx>
+        <w:tc>
+          <w:tcPr>
+            <w:tcW w:w="0" w:type="auto"/>
+            <w:tcBorders>
+              <w:bottom w:val="single" w:color="000000" w:sz="12" w:space="0"/>
+            </w:tcBorders>
+            <w:shd w:val="clear" w:color="auto" w:fill="FFFFFF"/>
+            <w:tcMar>
+              <w:top w:w="50" w:type="dxa"/>
+              <w:left w:w="100" w:type="dxa"/>
+              <w:bottom w:w="50" w:type="dxa"/>
+              <w:right w:w="100" w:type="dxa"/>
+            </w:tcMar>
+            <w:vAlign w:val="center"/>
+          </w:tcPr>
+          <w:p>
+            <w:pPr>
+              <w:ind w:firstLine="420" w:firstLineChars="200"/>
+              <w:jc w:val="center"/>
+              <w:rPr>
+                <w:rFonts w:hint="default" w:cs="Times New Roman"/>
+                <w:b w:val="0"/>
+                <w:color w:val="000000"/>
+                <w:lang w:val="en-US" w:eastAsia="zh-CN"/>
+              </w:rPr>
+            </w:pPr>
+            <w:r>
+              <w:rPr>
+                <w:rFonts w:hint="default" w:cs="Times New Roman"/>
+                <w:b w:val="0"/>
+                <w:color w:val="000000"/>
+                <w:lang w:val="en-US" w:eastAsia="zh-CN"/>
+              </w:rPr>
+              <w:t>打包工具</w:t>
+            </w:r>
+          </w:p>
+        </w:tc>
+        <w:tc>
+          <w:tcPr>
+            <w:tcW w:w="0" w:type="auto"/>
+            <w:tcBorders>
+              <w:bottom w:val="single" w:color="000000" w:sz="12" w:space="0"/>
+            </w:tcBorders>
+            <w:shd w:val="clear" w:color="auto" w:fill="FFFFFF"/>
+            <w:tcMar>
+              <w:top w:w="50" w:type="dxa"/>
+              <w:left w:w="100" w:type="dxa"/>
+              <w:bottom w:w="50" w:type="dxa"/>
+              <w:right w:w="100" w:type="dxa"/>
+            </w:tcMar>
+            <w:vAlign w:val="center"/>
+          </w:tcPr>
+          <w:p>
+            <w:pPr>
+              <w:ind w:firstLine="420" w:firstLineChars="200"/>
+              <w:jc w:val="center"/>
+              <w:rPr>
+                <w:rFonts w:hint="default" w:cs="Times New Roman"/>
+                <w:b w:val="0"/>
+                <w:color w:val="000000"/>
+                <w:lang w:val="en-US" w:eastAsia="zh-CN"/>
+              </w:rPr>
+            </w:pPr>
+            <w:r>
+              <w:rPr>
+                <w:rFonts w:hint="default" w:cs="Times New Roman"/>
+                <w:b w:val="0"/>
+                <w:color w:val="000000"/>
+                <w:lang w:val="en-US" w:eastAsia="zh-CN"/>
+              </w:rPr>
+              <w:t>PyInstaller</w:t>
+            </w:r>
+          </w:p>
+        </w:tc>
+        <w:tc>
+          <w:tcPr>
+            <w:tcW w:w="0" w:type="auto"/>
+            <w:tcBorders>
+              <w:bottom w:val="single" w:color="000000" w:sz="12" w:space="0"/>
+            </w:tcBorders>
+            <w:shd w:val="clear" w:color="auto" w:fill="FFFFFF"/>
+            <w:tcMar>
+              <w:top w:w="50" w:type="dxa"/>
+              <w:left w:w="100" w:type="dxa"/>
+              <w:bottom w:w="50" w:type="dxa"/>
+              <w:right w:w="100" w:type="dxa"/>
+            </w:tcMar>
+            <w:vAlign w:val="center"/>
+          </w:tcPr>
+          <w:p>
+            <w:pPr>
+              <w:ind w:firstLine="420" w:firstLineChars="200"/>
+              <w:jc w:val="center"/>
+              <w:rPr>
+                <w:rFonts w:hint="default" w:cs="Times New Roman"/>
+                <w:b w:val="0"/>
+                <w:color w:val="000000"/>
+                <w:lang w:val="en-US" w:eastAsia="zh-CN"/>
+              </w:rPr>
+            </w:pPr>
+            <w:r>
+              <w:rPr>
+                <w:rFonts w:hint="default" w:cs="Times New Roman"/>
+                <w:b w:val="0"/>
+                <w:color w:val="000000"/>
+                <w:lang w:val="en-US" w:eastAsia="zh-CN"/>
+              </w:rPr>
+              <w:t>构建独立可执行文件</w:t>
+            </w:r>
+          </w:p>
+        </w:tc>
+      </w:tr>
+    </w:tbl>
+    <w:p>
+      <w:pPr>
+        <w:ind w:firstLine="420" w:firstLineChars="200"/>
+        <w:jc w:val="center"/>
         <w:rPr>
           <w:rFonts w:hint="default" w:cs="Times New Roman"/>
           <w:lang w:val="en-US" w:eastAsia="zh-CN"/>
         </w:rPr>
       </w:pPr>
-      <w:r>
-        <w:rPr>
-          <w:rFonts w:hint="eastAsia" w:cs="Times New Roman"/>
-          <w:lang w:val="en-US" w:eastAsia="zh-CN"/>
-        </w:rPr>
-        <w:t>初始界面布局使用了顶部工具栏、左侧源码区、中央可视化区、右侧信息面板和底部状态栏结构。顶部工具栏包括“打开文件”“词法分析”和“语法分析”三大功能，输出的分析结果支持清空或导出。下方工作区分为左中右三部分。左侧为代码区，支持手写和通过rust文件导入两种形式。中央采用 Notebook 多标签布局：包括词法分析结果（token序列与彩色语法高亮源码，提供悬停高亮与统计信息）、语法树（层级树形可视化）、语法分析过程（逐步递归下降动画）和AST视图。同时提供错误视图，支持用户查看代码解析错误具体信息。右侧增加信息面板，提供AST节点属性，Token详情，符号表和节点统计信息。</w:t>
-      </w:r>
-    </w:p>
-    <w:p>
-      <w:pPr>
-        <w:ind w:firstLine="420" w:firstLineChars="200"/>
-        <w:rPr>
-          <w:rFonts w:hint="default" w:cs="Times New Roman"/>
-          <w:lang w:val="en-US" w:eastAsia="zh-CN"/>
-        </w:rPr>
-      </w:pPr>
-    </w:p>
-    <w:p>
-      <w:pPr>
-        <w:rPr>
-          <w:rFonts w:cs="Times New Roman"/>
-        </w:rPr>
-      </w:pPr>
-      <w:r>
-        <w:rPr>
-          <w:rFonts w:cs="Times New Roman"/>
-        </w:rPr>
-        <w:drawing>
-          <wp:inline distT="0" distB="0" distL="114300" distR="114300">
-            <wp:extent cx="5267960" cy="3065780"/>
-            <wp:effectExtent l="0" t="0" r="2540" b="7620"/>
-            <wp:docPr id="5" name="图片 1"/>
-            <wp:cNvGraphicFramePr>
-              <a:graphicFrameLocks xmlns:a="http://schemas.openxmlformats.org/drawingml/2006/main" noChangeAspect="1"/>
-            </wp:cNvGraphicFramePr>
-            <a:graphic xmlns:a="http://schemas.openxmlformats.org/drawingml/2006/main">
-              <a:graphicData uri="http://schemas.openxmlformats.org/drawingml/2006/picture">
-                <pic:pic xmlns:pic="http://schemas.openxmlformats.org/drawingml/2006/picture">
-                  <pic:nvPicPr>
-                    <pic:cNvPr id="5" name="图片 1"/>
-                    <pic:cNvPicPr>
-                      <a:picLocks noChangeAspect="1"/>
-                    </pic:cNvPicPr>
-                  </pic:nvPicPr>
-                  <pic:blipFill>
-                    <a:blip r:embed="rId7"/>
-                    <a:stretch>
-                      <a:fillRect/>
-                    </a:stretch>
-                  </pic:blipFill>
-                  <pic:spPr>
-                    <a:xfrm>
-                      <a:off x="0" y="0"/>
-                      <a:ext cx="5267960" cy="3065780"/>
-                    </a:xfrm>
-                    <a:prstGeom prst="rect">
-                      <a:avLst/>
-                    </a:prstGeom>
-                    <a:noFill/>
-                    <a:ln>
-                      <a:noFill/>
-                    </a:ln>
-                  </pic:spPr>
-                </pic:pic>
-              </a:graphicData>
-            </a:graphic>
-          </wp:inline>
-        </w:drawing>
-      </w:r>
     </w:p>
     <w:p>
       <w:pPr>
@@ -2150,7 +4435,7 @@
                     </pic:cNvPicPr>
                   </pic:nvPicPr>
                   <pic:blipFill>
-                    <a:blip r:embed="rId8"/>
+                    <a:blip r:embed="rId7"/>
                     <a:stretch>
                       <a:fillRect/>
                     </a:stretch>
@@ -2259,7 +4544,7 @@
                     </pic:cNvPicPr>
                   </pic:nvPicPr>
                   <pic:blipFill>
-                    <a:blip r:embed="rId9"/>
+                    <a:blip r:embed="rId8"/>
                     <a:stretch>
                       <a:fillRect/>
                     </a:stretch>
@@ -2326,7 +4611,7 @@
                     </pic:cNvPicPr>
                   </pic:nvPicPr>
                   <pic:blipFill>
-                    <a:blip r:embed="rId10"/>
+                    <a:blip r:embed="rId9"/>
                     <a:stretch>
                       <a:fillRect/>
                     </a:stretch>
@@ -2379,7 +4664,7 @@
                     </pic:cNvPicPr>
                   </pic:nvPicPr>
                   <pic:blipFill>
-                    <a:blip r:embed="rId11"/>
+                    <a:blip r:embed="rId10"/>
                     <a:stretch>
                       <a:fillRect/>
                     </a:stretch>
@@ -2597,7 +4882,7 @@
                     </pic:cNvPicPr>
                   </pic:nvPicPr>
                   <pic:blipFill>
-                    <a:blip r:embed="rId12"/>
+                    <a:blip r:embed="rId11"/>
                     <a:stretch>
                       <a:fillRect/>
                     </a:stretch>
@@ -2645,7 +4930,7 @@
                     </pic:cNvPicPr>
                   </pic:nvPicPr>
                   <pic:blipFill>
-                    <a:blip r:embed="rId13"/>
+                    <a:blip r:embed="rId12"/>
                     <a:stretch>
                       <a:fillRect/>
                     </a:stretch>
@@ -2688,7 +4973,7 @@
                     </pic:cNvPicPr>
                   </pic:nvPicPr>
                   <pic:blipFill>
-                    <a:blip r:embed="rId14"/>
+                    <a:blip r:embed="rId13"/>
                     <a:stretch>
                       <a:fillRect/>
                     </a:stretch>
@@ -2731,7 +5016,7 @@
                     </pic:cNvPicPr>
                   </pic:nvPicPr>
                   <pic:blipFill>
-                    <a:blip r:embed="rId15"/>
+                    <a:blip r:embed="rId14"/>
                     <a:stretch>
                       <a:fillRect/>
                     </a:stretch>
@@ -2779,7 +5064,7 @@
                     </pic:cNvPicPr>
                   </pic:nvPicPr>
                   <pic:blipFill>
-                    <a:blip r:embed="rId16"/>
+                    <a:blip r:embed="rId15"/>
                     <a:stretch>
                       <a:fillRect/>
                     </a:stretch>
@@ -2814,8 +5099,6 @@
         </w:rPr>
         <w:t>可以看到词法分析、语法分析过程、AST等结果都无误。可以点击“语法分析过程”一栏手动查看递归下降分析过程中每一步语法分析过程。</w:t>
       </w:r>
-      <w:bookmarkStart w:id="16" w:name="_GoBack"/>
-      <w:bookmarkEnd w:id="16"/>
     </w:p>
     <w:p>
       <w:pPr>
@@ -2970,7 +5253,7 @@
                     </pic:cNvPicPr>
                   </pic:nvPicPr>
                   <pic:blipFill>
-                    <a:blip r:embed="rId17"/>
+                    <a:blip r:embed="rId16"/>
                     <a:stretch>
                       <a:fillRect/>
                     </a:stretch>
@@ -3045,7 +5328,7 @@
                     </pic:cNvPicPr>
                   </pic:nvPicPr>
                   <pic:blipFill>
-                    <a:blip r:embed="rId18"/>
+                    <a:blip r:embed="rId17"/>
                     <a:stretch>
                       <a:fillRect/>
                     </a:stretch>
@@ -3105,7 +5388,7 @@
                     </pic:cNvPicPr>
                   </pic:nvPicPr>
                   <pic:blipFill>
-                    <a:blip r:embed="rId19"/>
+                    <a:blip r:embed="rId18"/>
                     <a:stretch>
                       <a:fillRect/>
                     </a:stretch>
@@ -3165,7 +5448,7 @@
                     </pic:cNvPicPr>
                   </pic:nvPicPr>
                   <pic:blipFill>
-                    <a:blip r:embed="rId20"/>
+                    <a:blip r:embed="rId19"/>
                     <a:stretch>
                       <a:fillRect/>
                     </a:stretch>
@@ -3225,7 +5508,7 @@
                     </pic:cNvPicPr>
                   </pic:nvPicPr>
                   <pic:blipFill>
-                    <a:blip r:embed="rId21"/>
+                    <a:blip r:embed="rId20"/>
                     <a:stretch>
                       <a:fillRect/>
                     </a:stretch>
@@ -3285,7 +5568,7 @@
                     </pic:cNvPicPr>
                   </pic:nvPicPr>
                   <pic:blipFill>
-                    <a:blip r:embed="rId22"/>
+                    <a:blip r:embed="rId21"/>
                     <a:stretch>
                       <a:fillRect/>
                     </a:stretch>
@@ -3348,7 +5631,7 @@
                     </pic:cNvPicPr>
                   </pic:nvPicPr>
                   <pic:blipFill>
-                    <a:blip r:embed="rId23"/>
+                    <a:blip r:embed="rId22"/>
                     <a:stretch>
                       <a:fillRect/>
                     </a:stretch>
@@ -3400,7 +5683,7 @@
                     </pic:cNvPicPr>
                   </pic:nvPicPr>
                   <pic:blipFill>
-                    <a:blip r:embed="rId24" cstate="print">
+                    <a:blip r:embed="rId23" cstate="print">
                       <a:extLst>
                         <a:ext uri="{28A0092B-C50C-407E-A947-70E740481C1C}">
                           <a14:useLocalDpi xmlns:a14="http://schemas.microsoft.com/office/drawing/2010/main" val="0"/>
@@ -3524,7 +5807,7 @@
     </w:p>
     <w:tbl>
       <w:tblPr>
-        <w:tblStyle w:val="8"/>
+        <w:tblStyle w:val="10"/>
         <w:tblW w:w="8393" w:type="dxa"/>
         <w:jc w:val="center"/>
         <w:tblLayout w:type="autofit"/>
@@ -6611,7 +8894,7 @@
     </w:p>
     <w:tbl>
       <w:tblPr>
-        <w:tblStyle w:val="8"/>
+        <w:tblStyle w:val="10"/>
         <w:tblW w:w="8393" w:type="dxa"/>
         <w:jc w:val="center"/>
         <w:tblLayout w:type="autofit"/>
@@ -9111,7 +11394,7 @@
                     </pic:cNvPicPr>
                   </pic:nvPicPr>
                   <pic:blipFill>
-                    <a:blip r:embed="rId25" cstate="print">
+                    <a:blip r:embed="rId24" cstate="print">
                       <a:extLst>
                         <a:ext uri="{28A0092B-C50C-407E-A947-70E740481C1C}">
                           <a14:useLocalDpi xmlns:a14="http://schemas.microsoft.com/office/drawing/2010/main" val="0"/>
@@ -10053,7 +12336,7 @@
     </w:p>
     <w:tbl>
       <w:tblPr>
-        <w:tblStyle w:val="8"/>
+        <w:tblStyle w:val="10"/>
         <w:tblW w:w="8423" w:type="dxa"/>
         <w:jc w:val="center"/>
         <w:tblLayout w:type="autofit"/>
@@ -11131,7 +13414,7 @@
     </w:p>
     <w:tbl>
       <w:tblPr>
-        <w:tblStyle w:val="8"/>
+        <w:tblStyle w:val="10"/>
         <w:tblW w:w="8423" w:type="dxa"/>
         <w:jc w:val="center"/>
         <w:tblLayout w:type="autofit"/>
@@ -11825,7 +14108,7 @@
     </w:p>
     <w:tbl>
       <w:tblPr>
-        <w:tblStyle w:val="8"/>
+        <w:tblStyle w:val="10"/>
         <w:tblW w:w="8423" w:type="dxa"/>
         <w:jc w:val="center"/>
         <w:tblLayout w:type="autofit"/>
@@ -12463,7 +14746,7 @@
                     </pic:cNvPicPr>
                   </pic:nvPicPr>
                   <pic:blipFill>
-                    <a:blip r:embed="rId26"/>
+                    <a:blip r:embed="rId25"/>
                     <a:stretch>
                       <a:fillRect/>
                     </a:stretch>
@@ -22477,7 +24760,7 @@
                     </pic:cNvPicPr>
                   </pic:nvPicPr>
                   <pic:blipFill>
-                    <a:blip r:embed="rId27"/>
+                    <a:blip r:embed="rId26"/>
                     <a:stretch>
                       <a:fillRect/>
                     </a:stretch>
@@ -22540,7 +24823,7 @@
                     </pic:cNvPicPr>
                   </pic:nvPicPr>
                   <pic:blipFill>
-                    <a:blip r:embed="rId28"/>
+                    <a:blip r:embed="rId27"/>
                     <a:stretch>
                       <a:fillRect/>
                     </a:stretch>
@@ -22603,7 +24886,7 @@
                     </pic:cNvPicPr>
                   </pic:nvPicPr>
                   <pic:blipFill>
-                    <a:blip r:embed="rId29"/>
+                    <a:blip r:embed="rId28"/>
                     <a:stretch>
                       <a:fillRect/>
                     </a:stretch>
@@ -37634,7 +39917,401 @@
     </w:p>
     <w:p>
       <w:pPr>
-        <w:ind w:firstLine="420" w:firstLineChars="200"/>
+        <w:bidi w:val="0"/>
+        <w:rPr>
+          <w:rFonts w:hint="eastAsia"/>
+          <w:lang w:val="en-US" w:eastAsia="zh-CN"/>
+        </w:rPr>
+      </w:pPr>
+      <w:r>
+        <w:rPr>
+          <w:rFonts w:hint="eastAsia"/>
+          <w:lang w:val="en-US" w:eastAsia="zh-CN"/>
+        </w:rPr>
+        <w:t>3.1 模块划分与文档结构</w:t>
+      </w:r>
+    </w:p>
+    <w:tbl>
+      <w:tblPr>
+        <w:tblStyle w:val="11"/>
+        <w:tblW w:w="0" w:type="auto"/>
+        <w:tblInd w:w="0" w:type="dxa"/>
+        <w:tblBorders>
+          <w:top w:val="single" w:color="auto" w:sz="4" w:space="0"/>
+          <w:left w:val="single" w:color="auto" w:sz="4" w:space="0"/>
+          <w:bottom w:val="single" w:color="auto" w:sz="4" w:space="0"/>
+          <w:right w:val="single" w:color="auto" w:sz="4" w:space="0"/>
+          <w:insideH w:val="single" w:color="auto" w:sz="4" w:space="0"/>
+          <w:insideV w:val="single" w:color="auto" w:sz="4" w:space="0"/>
+        </w:tblBorders>
+        <w:tblLayout w:type="autofit"/>
+        <w:tblCellMar>
+          <w:left w:w="108" w:type="dxa"/>
+          <w:right w:w="108" w:type="dxa"/>
+        </w:tblCellMar>
+      </w:tblPr>
+      <w:tblGrid>
+        <w:gridCol w:w="8522"/>
+      </w:tblGrid>
+      <w:tr>
+        <w:tblPrEx>
+          <w:tblBorders>
+            <w:top w:val="single" w:color="auto" w:sz="4" w:space="0"/>
+            <w:left w:val="single" w:color="auto" w:sz="4" w:space="0"/>
+            <w:bottom w:val="single" w:color="auto" w:sz="4" w:space="0"/>
+            <w:right w:val="single" w:color="auto" w:sz="4" w:space="0"/>
+            <w:insideH w:val="single" w:color="auto" w:sz="4" w:space="0"/>
+            <w:insideV w:val="single" w:color="auto" w:sz="4" w:space="0"/>
+          </w:tblBorders>
+          <w:tblCellMar>
+            <w:left w:w="108" w:type="dxa"/>
+            <w:right w:w="108" w:type="dxa"/>
+          </w:tblCellMar>
+        </w:tblPrEx>
+        <w:tc>
+          <w:tcPr>
+            <w:tcW w:w="8522" w:type="dxa"/>
+          </w:tcPr>
+          <w:p>
+            <w:pPr>
+              <w:bidi w:val="0"/>
+              <w:spacing w:line="240" w:lineRule="auto"/>
+              <w:rPr>
+                <w:rFonts w:hint="eastAsia"/>
+                <w:sz w:val="21"/>
+                <w:szCs w:val="21"/>
+                <w:vertAlign w:val="baseline"/>
+                <w:lang w:val="en-US" w:eastAsia="zh-CN"/>
+              </w:rPr>
+            </w:pPr>
+            <w:r>
+              <w:rPr>
+                <w:rFonts w:hint="eastAsia"/>
+                <w:sz w:val="21"/>
+                <w:szCs w:val="21"/>
+                <w:vertAlign w:val="baseline"/>
+                <w:lang w:val="en-US" w:eastAsia="zh-CN"/>
+              </w:rPr>
+              <w:t>├── visualization.py          # 纯文本 AST 可视化（递归树/结构式）</w:t>
+            </w:r>
+          </w:p>
+          <w:p>
+            <w:pPr>
+              <w:bidi w:val="0"/>
+              <w:spacing w:line="240" w:lineRule="auto"/>
+              <w:rPr>
+                <w:rFonts w:hint="eastAsia"/>
+                <w:sz w:val="21"/>
+                <w:szCs w:val="21"/>
+                <w:vertAlign w:val="baseline"/>
+                <w:lang w:val="en-US" w:eastAsia="zh-CN"/>
+              </w:rPr>
+            </w:pPr>
+            <w:r>
+              <w:rPr>
+                <w:rFonts w:hint="eastAsia"/>
+                <w:sz w:val="21"/>
+                <w:szCs w:val="21"/>
+                <w:vertAlign w:val="baseline"/>
+                <w:lang w:val="en-US" w:eastAsia="zh-CN"/>
+              </w:rPr>
+              <w:t>├── visualizer_gui.py         # Tkinter GUI 可视化组件库（~2565行）</w:t>
+            </w:r>
+          </w:p>
+          <w:p>
+            <w:pPr>
+              <w:bidi w:val="0"/>
+              <w:spacing w:line="240" w:lineRule="auto"/>
+              <w:rPr>
+                <w:rFonts w:hint="eastAsia"/>
+                <w:sz w:val="21"/>
+                <w:szCs w:val="21"/>
+                <w:vertAlign w:val="baseline"/>
+                <w:lang w:val="en-US" w:eastAsia="zh-CN"/>
+              </w:rPr>
+            </w:pPr>
+            <w:r>
+              <w:rPr>
+                <w:rFonts w:hint="eastAsia"/>
+                <w:sz w:val="21"/>
+                <w:szCs w:val="21"/>
+                <w:vertAlign w:val="baseline"/>
+                <w:lang w:val="en-US" w:eastAsia="zh-CN"/>
+              </w:rPr>
+              <w:t>│   ├── TokenViewer           # 词法分析视图</w:t>
+            </w:r>
+          </w:p>
+          <w:p>
+            <w:pPr>
+              <w:bidi w:val="0"/>
+              <w:spacing w:line="240" w:lineRule="auto"/>
+              <w:rPr>
+                <w:rFonts w:hint="eastAsia"/>
+                <w:sz w:val="21"/>
+                <w:szCs w:val="21"/>
+                <w:vertAlign w:val="baseline"/>
+                <w:lang w:val="en-US" w:eastAsia="zh-CN"/>
+              </w:rPr>
+            </w:pPr>
+            <w:r>
+              <w:rPr>
+                <w:rFonts w:hint="eastAsia"/>
+                <w:sz w:val="21"/>
+                <w:szCs w:val="21"/>
+                <w:vertAlign w:val="baseline"/>
+                <w:lang w:val="en-US" w:eastAsia="zh-CN"/>
+              </w:rPr>
+              <w:t>│   ├── SyntaxTreeViewer      # 语法树视图（CST风格）</w:t>
+            </w:r>
+          </w:p>
+          <w:p>
+            <w:pPr>
+              <w:bidi w:val="0"/>
+              <w:spacing w:line="240" w:lineRule="auto"/>
+              <w:rPr>
+                <w:rFonts w:hint="eastAsia"/>
+                <w:sz w:val="21"/>
+                <w:szCs w:val="21"/>
+                <w:vertAlign w:val="baseline"/>
+                <w:lang w:val="en-US" w:eastAsia="zh-CN"/>
+              </w:rPr>
+            </w:pPr>
+            <w:r>
+              <w:rPr>
+                <w:rFonts w:hint="eastAsia"/>
+                <w:sz w:val="21"/>
+                <w:szCs w:val="21"/>
+                <w:vertAlign w:val="baseline"/>
+                <w:lang w:val="en-US" w:eastAsia="zh-CN"/>
+              </w:rPr>
+              <w:t>│   ├── ASTGraphViewer        # 交互式 AST 图（Canvas）</w:t>
+            </w:r>
+          </w:p>
+          <w:p>
+            <w:pPr>
+              <w:bidi w:val="0"/>
+              <w:spacing w:line="240" w:lineRule="auto"/>
+              <w:rPr>
+                <w:rFonts w:hint="eastAsia"/>
+                <w:sz w:val="21"/>
+                <w:szCs w:val="21"/>
+                <w:vertAlign w:val="baseline"/>
+                <w:lang w:val="en-US" w:eastAsia="zh-CN"/>
+              </w:rPr>
+            </w:pPr>
+            <w:r>
+              <w:rPr>
+                <w:rFonts w:hint="eastAsia"/>
+                <w:sz w:val="21"/>
+                <w:szCs w:val="21"/>
+                <w:vertAlign w:val="baseline"/>
+                <w:lang w:val="en-US" w:eastAsia="zh-CN"/>
+              </w:rPr>
+              <w:t>│   ├── ErrorDisplay          # 错误/警告消息展示</w:t>
+            </w:r>
+          </w:p>
+          <w:p>
+            <w:pPr>
+              <w:bidi w:val="0"/>
+              <w:spacing w:line="240" w:lineRule="auto"/>
+              <w:rPr>
+                <w:rFonts w:hint="eastAsia"/>
+                <w:sz w:val="21"/>
+                <w:szCs w:val="21"/>
+                <w:vertAlign w:val="baseline"/>
+                <w:lang w:val="en-US" w:eastAsia="zh-CN"/>
+              </w:rPr>
+            </w:pPr>
+            <w:r>
+              <w:rPr>
+                <w:rFonts w:hint="eastAsia"/>
+                <w:sz w:val="21"/>
+                <w:szCs w:val="21"/>
+                <w:vertAlign w:val="baseline"/>
+                <w:lang w:val="en-US" w:eastAsia="zh-CN"/>
+              </w:rPr>
+              <w:t>│   ├── InfoPanel             # 右侧信息面板（属性/Token/符号表/统计）</w:t>
+            </w:r>
+          </w:p>
+          <w:p>
+            <w:pPr>
+              <w:bidi w:val="0"/>
+              <w:spacing w:line="240" w:lineRule="auto"/>
+              <w:rPr>
+                <w:rFonts w:hint="eastAsia"/>
+                <w:sz w:val="21"/>
+                <w:szCs w:val="21"/>
+                <w:vertAlign w:val="baseline"/>
+                <w:lang w:val="en-US" w:eastAsia="zh-CN"/>
+              </w:rPr>
+            </w:pPr>
+            <w:r>
+              <w:rPr>
+                <w:rFonts w:hint="eastAsia"/>
+                <w:sz w:val="21"/>
+                <w:szCs w:val="21"/>
+                <w:vertAlign w:val="baseline"/>
+                <w:lang w:val="en-US" w:eastAsia="zh-CN"/>
+              </w:rPr>
+              <w:t>│   └── ParserProcessViewer   # 解析过程逐步动画</w:t>
+            </w:r>
+          </w:p>
+          <w:p>
+            <w:pPr>
+              <w:bidi w:val="0"/>
+              <w:spacing w:line="240" w:lineRule="auto"/>
+              <w:rPr>
+                <w:rFonts w:hint="eastAsia"/>
+                <w:sz w:val="21"/>
+                <w:szCs w:val="21"/>
+                <w:vertAlign w:val="baseline"/>
+                <w:lang w:val="en-US" w:eastAsia="zh-CN"/>
+              </w:rPr>
+            </w:pPr>
+            <w:r>
+              <w:rPr>
+                <w:rFonts w:hint="eastAsia"/>
+                <w:sz w:val="21"/>
+                <w:szCs w:val="21"/>
+                <w:vertAlign w:val="baseline"/>
+                <w:lang w:val="en-US" w:eastAsia="zh-CN"/>
+              </w:rPr>
+              <w:t>├── main.py                   # Tkinter 桌面应用主入口</w:t>
+            </w:r>
+          </w:p>
+          <w:p>
+            <w:pPr>
+              <w:bidi w:val="0"/>
+              <w:spacing w:line="240" w:lineRule="auto"/>
+              <w:rPr>
+                <w:rFonts w:hint="eastAsia"/>
+                <w:sz w:val="21"/>
+                <w:szCs w:val="21"/>
+                <w:vertAlign w:val="baseline"/>
+                <w:lang w:val="en-US" w:eastAsia="zh-CN"/>
+              </w:rPr>
+            </w:pPr>
+            <w:r>
+              <w:rPr>
+                <w:rFonts w:hint="eastAsia"/>
+                <w:sz w:val="21"/>
+                <w:szCs w:val="21"/>
+                <w:vertAlign w:val="baseline"/>
+                <w:lang w:val="en-US" w:eastAsia="zh-CN"/>
+              </w:rPr>
+              <w:t>├── web_app.py                # Flask 后端 + AST JSON 序列化</w:t>
+            </w:r>
+          </w:p>
+          <w:p>
+            <w:pPr>
+              <w:bidi w:val="0"/>
+              <w:spacing w:line="240" w:lineRule="auto"/>
+              <w:rPr>
+                <w:rFonts w:hint="eastAsia"/>
+                <w:sz w:val="21"/>
+                <w:szCs w:val="21"/>
+                <w:vertAlign w:val="baseline"/>
+                <w:lang w:val="en-US" w:eastAsia="zh-CN"/>
+              </w:rPr>
+            </w:pPr>
+            <w:r>
+              <w:rPr>
+                <w:rFonts w:hint="eastAsia"/>
+                <w:sz w:val="21"/>
+                <w:szCs w:val="21"/>
+                <w:vertAlign w:val="baseline"/>
+                <w:lang w:val="en-US" w:eastAsia="zh-CN"/>
+              </w:rPr>
+              <w:t>├── main_app.py               # PyWebView 桌面入口</w:t>
+            </w:r>
+          </w:p>
+          <w:p>
+            <w:pPr>
+              <w:bidi w:val="0"/>
+              <w:spacing w:line="240" w:lineRule="auto"/>
+              <w:rPr>
+                <w:rFonts w:hint="eastAsia"/>
+                <w:sz w:val="21"/>
+                <w:szCs w:val="21"/>
+                <w:vertAlign w:val="baseline"/>
+                <w:lang w:val="en-US" w:eastAsia="zh-CN"/>
+              </w:rPr>
+            </w:pPr>
+            <w:r>
+              <w:rPr>
+                <w:rFonts w:hint="eastAsia"/>
+                <w:sz w:val="21"/>
+                <w:szCs w:val="21"/>
+                <w:vertAlign w:val="baseline"/>
+                <w:lang w:val="en-US" w:eastAsia="zh-CN"/>
+              </w:rPr>
+              <w:t>└── templates/index.html      # Web 前端 SPA（~1240行，内联 CSS/JS）</w:t>
+            </w:r>
+          </w:p>
+        </w:tc>
+      </w:tr>
+    </w:tbl>
+    <w:p>
+      <w:pPr>
+        <w:bidi w:val="0"/>
+        <w:rPr>
+          <w:rFonts w:hint="eastAsia"/>
+          <w:lang w:val="en-US" w:eastAsia="zh-CN"/>
+        </w:rPr>
+      </w:pPr>
+      <w:r>
+        <w:rPr>
+          <w:rFonts w:hint="eastAsia"/>
+          <w:lang w:val="en-US" w:eastAsia="zh-CN"/>
+        </w:rPr>
+        <w:t>3.2 关键模块设计</w:t>
+      </w:r>
+    </w:p>
+    <w:p>
+      <w:pPr>
+        <w:bidi w:val="0"/>
+        <w:rPr>
+          <w:rFonts w:hint="default"/>
+          <w:lang w:val="en-US" w:eastAsia="zh-CN"/>
+        </w:rPr>
+      </w:pPr>
+      <w:r>
+        <w:rPr>
+          <w:rFonts w:hint="eastAsia"/>
+          <w:lang w:val="en-US" w:eastAsia="zh-CN"/>
+        </w:rPr>
+        <w:t>3</w:t>
+      </w:r>
+      <w:r>
+        <w:rPr>
+          <w:rFonts w:hint="default"/>
+          <w:lang w:val="en-US" w:eastAsia="zh-CN"/>
+        </w:rPr>
+        <w:t>.2.1 纯文本 AST 可视化 — visualization.py</w:t>
+      </w:r>
+    </w:p>
+    <w:p>
+      <w:pPr>
+        <w:bidi w:val="0"/>
+        <w:rPr>
+          <w:rFonts w:hint="default"/>
+          <w:lang w:val="en-US" w:eastAsia="zh-CN"/>
+        </w:rPr>
+      </w:pPr>
+    </w:p>
+    <w:p>
+      <w:pPr>
+        <w:bidi w:val="0"/>
+        <w:rPr>
+          <w:rFonts w:hint="default"/>
+          <w:lang w:val="en-US" w:eastAsia="zh-CN"/>
+        </w:rPr>
+      </w:pPr>
+    </w:p>
+    <w:p>
+      <w:pPr>
+        <w:spacing w:before="156" w:beforeLines="50" w:after="156" w:afterLines="50"/>
+        <w:outlineLvl w:val="0"/>
         <w:rPr>
           <w:rFonts w:eastAsia="黑体" w:cs="Times New Roman"/>
           <w:b/>
@@ -37643,17 +40320,8 @@
           <w:szCs w:val="32"/>
         </w:rPr>
       </w:pPr>
-      <w:r>
-        <w:rPr>
-          <w:rFonts w:cs="Times New Roman"/>
-        </w:rPr>
-        <w:t>文字。</w:t>
-      </w:r>
-    </w:p>
-    <w:p>
-      <w:pPr>
-        <w:spacing w:before="156" w:beforeLines="50" w:after="156" w:afterLines="50"/>
-        <w:outlineLvl w:val="0"/>
+      <w:bookmarkStart w:id="13" w:name="_Toc31160"/>
+      <w:r>
         <w:rPr>
           <w:rFonts w:eastAsia="黑体" w:cs="Times New Roman"/>
           <w:b/>
@@ -37661,9 +40329,14 @@
           <w:sz w:val="28"/>
           <w:szCs w:val="32"/>
         </w:rPr>
-      </w:pPr>
-      <w:bookmarkStart w:id="13" w:name="_Toc31160"/>
-      <w:r>
+        <w:t>四、总结</w:t>
+      </w:r>
+      <w:bookmarkEnd w:id="13"/>
+    </w:p>
+    <w:p>
+      <w:pPr>
+        <w:spacing w:before="156" w:beforeLines="50" w:after="156" w:afterLines="50"/>
+        <w:outlineLvl w:val="0"/>
         <w:rPr>
           <w:rFonts w:eastAsia="黑体" w:cs="Times New Roman"/>
           <w:b/>
@@ -37671,14 +40344,9 @@
           <w:sz w:val="28"/>
           <w:szCs w:val="32"/>
         </w:rPr>
-        <w:t>四、总结</w:t>
-      </w:r>
-      <w:bookmarkEnd w:id="13"/>
-    </w:p>
-    <w:p>
-      <w:pPr>
-        <w:spacing w:before="156" w:beforeLines="50" w:after="156" w:afterLines="50"/>
-        <w:outlineLvl w:val="0"/>
+      </w:pPr>
+      <w:bookmarkStart w:id="14" w:name="_Toc14295"/>
+      <w:r>
         <w:rPr>
           <w:rFonts w:eastAsia="黑体" w:cs="Times New Roman"/>
           <w:b/>
@@ -37686,23 +40354,13 @@
           <w:sz w:val="28"/>
           <w:szCs w:val="32"/>
         </w:rPr>
-      </w:pPr>
-      <w:bookmarkStart w:id="14" w:name="_Toc14295"/>
-      <w:r>
-        <w:rPr>
-          <w:rFonts w:eastAsia="黑体" w:cs="Times New Roman"/>
-          <w:b/>
-          <w:bCs/>
-          <w:sz w:val="28"/>
-          <w:szCs w:val="32"/>
-        </w:rPr>
         <w:t>五、小组分工</w:t>
       </w:r>
       <w:bookmarkEnd w:id="14"/>
     </w:p>
     <w:tbl>
       <w:tblPr>
-        <w:tblStyle w:val="9"/>
+        <w:tblStyle w:val="11"/>
         <w:tblW w:w="0" w:type="auto"/>
         <w:tblInd w:w="0" w:type="dxa"/>
         <w:tblBorders>
@@ -37898,6 +40556,7 @@
                 <w:rFonts w:cs="Times New Roman"/>
               </w:rPr>
             </w:pPr>
+            <w:bookmarkStart w:id="16" w:name="_GoBack"/>
             <w:r>
               <w:rPr>
                 <w:rFonts w:cs="Times New Roman"/>
@@ -37945,6 +40604,7 @@
           </w:p>
         </w:tc>
       </w:tr>
+      <w:bookmarkEnd w:id="16"/>
       <w:tr>
         <w:tblPrEx>
           <w:tblBorders>
@@ -38069,14 +40729,14 @@
       </w:r>
       <w:r>
         <w:rPr>
-          <w:rStyle w:val="13"/>
+          <w:rStyle w:val="15"/>
           <w:rFonts w:cs="Times New Roman"/>
         </w:rPr>
         <w:t>https://blog.csdn.net/qq_41548460/article/details/105774539</w:t>
       </w:r>
       <w:r>
         <w:rPr>
-          <w:rStyle w:val="13"/>
+          <w:rStyle w:val="15"/>
           <w:rFonts w:cs="Times New Roman"/>
         </w:rPr>
         <w:fldChar w:fldCharType="end"/>
@@ -38105,14 +40765,14 @@
       </w:r>
       <w:r>
         <w:rPr>
-          <w:rStyle w:val="13"/>
+          <w:rStyle w:val="15"/>
           <w:rFonts w:cs="Times New Roman"/>
         </w:rPr>
         <w:t>https://zhuanlan.zhihu.com/p/654321098</w:t>
       </w:r>
       <w:r>
         <w:rPr>
-          <w:rStyle w:val="13"/>
+          <w:rStyle w:val="15"/>
           <w:rFonts w:cs="Times New Roman"/>
         </w:rPr>
         <w:fldChar w:fldCharType="end"/>
@@ -38476,7 +41136,7 @@
     <w:lsdException w:unhideWhenUsed="0" w:uiPriority="0" w:semiHidden="0" w:name="HTML Sample"/>
     <w:lsdException w:unhideWhenUsed="0" w:uiPriority="0" w:semiHidden="0" w:name="HTML Typewriter"/>
     <w:lsdException w:unhideWhenUsed="0" w:uiPriority="0" w:semiHidden="0" w:name="HTML Variable"/>
-    <w:lsdException w:uiPriority="99" w:name="Normal Table"/>
+    <w:lsdException w:qFormat="1" w:uiPriority="99" w:name="Normal Table"/>
     <w:lsdException w:unhideWhenUsed="0" w:uiPriority="0" w:semiHidden="0" w:name="annotation subject"/>
     <w:lsdException w:uiPriority="0" w:name="Table Simple 1"/>
     <w:lsdException w:uiPriority="0" w:name="Table Simple 2"/>
@@ -38682,7 +41342,7 @@
     <w:name w:val="heading 3"/>
     <w:basedOn w:val="1"/>
     <w:next w:val="1"/>
-    <w:link w:val="15"/>
+    <w:link w:val="17"/>
     <w:semiHidden/>
     <w:unhideWhenUsed/>
     <w:qFormat/>
@@ -38700,15 +41360,38 @@
       <w:szCs w:val="32"/>
     </w:rPr>
   </w:style>
-  <w:style w:type="character" w:default="1" w:styleId="10">
+  <w:style w:type="paragraph" w:styleId="5">
+    <w:name w:val="heading 4"/>
+    <w:basedOn w:val="1"/>
+    <w:next w:val="1"/>
+    <w:semiHidden/>
+    <w:unhideWhenUsed/>
+    <w:qFormat/>
+    <w:uiPriority w:val="0"/>
+    <w:pPr>
+      <w:spacing w:before="0" w:beforeAutospacing="1" w:after="0" w:afterAutospacing="1"/>
+      <w:jc w:val="left"/>
+    </w:pPr>
+    <w:rPr>
+      <w:rFonts w:hint="eastAsia" w:ascii="宋体" w:hAnsi="宋体" w:eastAsia="宋体" w:cs="宋体"/>
+      <w:b/>
+      <w:bCs/>
+      <w:kern w:val="0"/>
+      <w:sz w:val="24"/>
+      <w:szCs w:val="24"/>
+      <w:lang w:val="en-US" w:eastAsia="zh-CN" w:bidi="ar"/>
+    </w:rPr>
+  </w:style>
+  <w:style w:type="character" w:default="1" w:styleId="12">
     <w:name w:val="Default Paragraph Font"/>
     <w:unhideWhenUsed/>
     <w:uiPriority w:val="1"/>
   </w:style>
-  <w:style w:type="table" w:default="1" w:styleId="8">
+  <w:style w:type="table" w:default="1" w:styleId="10">
     <w:name w:val="Normal Table"/>
     <w:semiHidden/>
     <w:unhideWhenUsed/>
+    <w:qFormat/>
     <w:uiPriority w:val="99"/>
     <w:tblPr>
       <w:tblCellMar>
@@ -38719,7 +41402,7 @@
       </w:tblCellMar>
     </w:tblPr>
   </w:style>
-  <w:style w:type="paragraph" w:styleId="5">
+  <w:style w:type="paragraph" w:styleId="6">
     <w:name w:val="toc 1"/>
     <w:basedOn w:val="1"/>
     <w:next w:val="1"/>
@@ -38727,7 +41410,7 @@
     <w:qFormat/>
     <w:uiPriority w:val="39"/>
   </w:style>
-  <w:style w:type="paragraph" w:styleId="6">
+  <w:style w:type="paragraph" w:styleId="7">
     <w:name w:val="toc 2"/>
     <w:basedOn w:val="1"/>
     <w:next w:val="1"/>
@@ -38738,7 +41421,40 @@
       <w:ind w:left="420" w:leftChars="200"/>
     </w:pPr>
   </w:style>
-  <w:style w:type="paragraph" w:styleId="7">
+  <w:style w:type="paragraph" w:styleId="8">
+    <w:name w:val="HTML Preformatted"/>
+    <w:basedOn w:val="1"/>
+    <w:uiPriority w:val="0"/>
+    <w:pPr>
+      <w:tabs>
+        <w:tab w:val="left" w:pos="916"/>
+        <w:tab w:val="left" w:pos="1832"/>
+        <w:tab w:val="left" w:pos="2748"/>
+        <w:tab w:val="left" w:pos="3664"/>
+        <w:tab w:val="left" w:pos="4580"/>
+        <w:tab w:val="left" w:pos="5496"/>
+        <w:tab w:val="left" w:pos="6412"/>
+        <w:tab w:val="left" w:pos="7328"/>
+        <w:tab w:val="left" w:pos="8244"/>
+        <w:tab w:val="left" w:pos="9160"/>
+        <w:tab w:val="left" w:pos="10076"/>
+        <w:tab w:val="left" w:pos="10992"/>
+        <w:tab w:val="left" w:pos="11908"/>
+        <w:tab w:val="left" w:pos="12824"/>
+        <w:tab w:val="left" w:pos="13740"/>
+        <w:tab w:val="left" w:pos="14656"/>
+      </w:tabs>
+      <w:jc w:val="left"/>
+    </w:pPr>
+    <w:rPr>
+      <w:rFonts w:hint="eastAsia" w:ascii="宋体" w:hAnsi="宋体" w:eastAsia="宋体" w:cs="宋体"/>
+      <w:kern w:val="0"/>
+      <w:sz w:val="24"/>
+      <w:szCs w:val="24"/>
+      <w:lang w:val="en-US" w:eastAsia="zh-CN" w:bidi="ar"/>
+    </w:rPr>
+  </w:style>
+  <w:style w:type="paragraph" w:styleId="9">
     <w:name w:val="Normal (Web)"/>
     <w:basedOn w:val="1"/>
     <w:uiPriority w:val="0"/>
@@ -38753,9 +41469,9 @@
       <w:lang w:val="en-US" w:eastAsia="zh-CN" w:bidi="ar"/>
     </w:rPr>
   </w:style>
-  <w:style w:type="table" w:styleId="9">
+  <w:style w:type="table" w:styleId="11">
     <w:name w:val="Table Grid"/>
-    <w:basedOn w:val="8"/>
+    <w:basedOn w:val="10"/>
     <w:qFormat/>
     <w:uiPriority w:val="0"/>
     <w:pPr>
@@ -38773,18 +41489,18 @@
       </w:tblBorders>
     </w:tblPr>
   </w:style>
-  <w:style w:type="character" w:styleId="11">
+  <w:style w:type="character" w:styleId="13">
     <w:name w:val="Strong"/>
-    <w:basedOn w:val="10"/>
+    <w:basedOn w:val="12"/>
     <w:qFormat/>
     <w:uiPriority w:val="0"/>
     <w:rPr>
       <w:b/>
     </w:rPr>
   </w:style>
-  <w:style w:type="character" w:styleId="12">
+  <w:style w:type="character" w:styleId="14">
     <w:name w:val="FollowedHyperlink"/>
-    <w:basedOn w:val="10"/>
+    <w:basedOn w:val="12"/>
     <w:semiHidden/>
     <w:unhideWhenUsed/>
     <w:qFormat/>
@@ -38794,9 +41510,9 @@
       <w:u w:val="single"/>
     </w:rPr>
   </w:style>
-  <w:style w:type="character" w:styleId="13">
+  <w:style w:type="character" w:styleId="15">
     <w:name w:val="Hyperlink"/>
-    <w:basedOn w:val="10"/>
+    <w:basedOn w:val="12"/>
     <w:unhideWhenUsed/>
     <w:qFormat/>
     <w:uiPriority w:val="99"/>
@@ -38810,9 +41526,9 @@
       </w14:textFill>
     </w:rPr>
   </w:style>
-  <w:style w:type="character" w:styleId="14">
+  <w:style w:type="character" w:styleId="16">
     <w:name w:val="HTML Code"/>
-    <w:basedOn w:val="10"/>
+    <w:basedOn w:val="12"/>
     <w:qFormat/>
     <w:uiPriority w:val="0"/>
     <w:rPr>
@@ -38820,9 +41536,9 @@
       <w:sz w:val="20"/>
     </w:rPr>
   </w:style>
-  <w:style w:type="character" w:customStyle="1" w:styleId="15">
+  <w:style w:type="character" w:customStyle="1" w:styleId="17">
     <w:name w:val="标题 3 字符"/>
-    <w:basedOn w:val="10"/>
+    <w:basedOn w:val="12"/>
     <w:link w:val="4"/>
     <w:semiHidden/>
     <w:qFormat/>

</xml_diff>